<commit_message>
Publish polished portfolio copy
</commit_message>
<xml_diff>
--- a/resume/Alan_Zhu_Resume_CN.docx
+++ b/resume/Alan_Zhu_Resume_CN.docx
@@ -4,1055 +4,633 @@
   <w:body>
     <w:p>
       <w:pPr>
-        <w:spacing w:after="60"/>
-        <w:jc w:val="left"/>
+        <w:pStyle w:val="Heading1"/>
+        <w:jc w:val="center"/>
       </w:pPr>
       <w:r>
-        <w:rPr>
-          <w:rFonts w:ascii="Aptos" w:hAnsi="Aptos" w:eastAsia="Microsoft YaHei"/>
-          <w:b/>
-          <w:color w:val="0D5258"/>
-          <w:sz w:val="42"/>
-        </w:rPr>
         <w:t>朱正飞（Alan Zhu）</w:t>
       </w:r>
     </w:p>
     <w:p>
-      <w:pPr>
-        <w:spacing w:before="0" w:after="40" w:line="259" w:lineRule="auto"/>
-      </w:pPr>
       <w:r>
         <w:rPr>
-          <w:rFonts w:ascii="Aptos" w:hAnsi="Aptos" w:eastAsia="Microsoft YaHei"/>
-          <w:b w:val="0"/>
-          <w:color w:val="4C5660"/>
-          <w:sz w:val="19"/>
+          <w:b/>
         </w:rPr>
-        <w:t>双语 IT Service Desk 专家 | 全球用户支持 | ServiceNow / Microsoft 365 / ITIL | AI 辅助支持文档</w:t>
+        <w:t>双语 IT 技术支持专家 | ITSM Support Analyst | Microsoft 365 / ServiceNow / 知识管理 | AI 辅助支持流程</w:t>
       </w:r>
     </w:p>
     <w:p>
-      <w:pPr>
-        <w:spacing w:before="0" w:after="40" w:line="259" w:lineRule="auto"/>
-      </w:pPr>
       <w:r>
-        <w:rPr>
-          <w:rFonts w:ascii="Aptos" w:hAnsi="Aptos" w:eastAsia="Microsoft YaHei"/>
-          <w:b w:val="0"/>
-          <w:color w:val="4C5660"/>
-          <w:sz w:val="19"/>
-        </w:rPr>
-        <w:t>深圳，中国 | 国外电话：+1 469 209 9928 | 国内电话/微信：+86 132 6720 5713</w:t>
+        <w:t>深圳，中国 | WhatsApp / Telegram：+1 460 209 9928 | 国内电话 / 微信：+86 132 6720 5713</w:t>
       </w:r>
     </w:p>
     <w:p>
-      <w:pPr>
-        <w:spacing w:before="0" w:after="80" w:line="269" w:lineRule="auto"/>
-      </w:pPr>
       <w:r>
-        <w:rPr>
-          <w:rFonts w:ascii="Aptos" w:hAnsi="Aptos" w:eastAsia="Microsoft YaHei"/>
-          <w:b w:val="0"/>
-          <w:color w:val="2C3741"/>
-          <w:sz w:val="20"/>
-        </w:rPr>
         <w:t>邮箱：alan.xiaofei224@gmail.com | 备用邮箱：alan.xiaofei993@outlook.com</w:t>
       </w:r>
     </w:p>
     <w:p>
-      <w:pPr>
-        <w:spacing w:before="0" w:after="80" w:line="269" w:lineRule="auto"/>
-      </w:pPr>
       <w:r>
-        <w:rPr>
-          <w:rFonts w:ascii="Aptos" w:hAnsi="Aptos" w:eastAsia="Microsoft YaHei"/>
-          <w:b w:val="0"/>
-          <w:color w:val="2C3741"/>
-          <w:sz w:val="20"/>
-        </w:rPr>
         <w:t>LinkedIn：www.linkedin.com/in/alan-zhu-221846320</w:t>
       </w:r>
     </w:p>
     <w:p>
       <w:pPr>
-        <w:spacing w:before="160" w:after="80" w:line="259" w:lineRule="auto"/>
-        <w:pBdr>
-          <w:bottom w:val="single" w:sz="6" w:space="8" w:color="CFE1DE"/>
-        </w:pBdr>
+        <w:pStyle w:val="Heading2"/>
       </w:pPr>
       <w:r>
-        <w:rPr>
-          <w:rFonts w:ascii="Aptos" w:hAnsi="Aptos" w:eastAsia="Microsoft YaHei"/>
-          <w:b/>
-          <w:color w:val="0D5258"/>
-          <w:sz w:val="25"/>
-        </w:rPr>
-        <w:t>求职定位</w:t>
+        <w:t>个人简介</w:t>
+      </w:r>
+    </w:p>
+    <w:p>
+      <w:r>
+        <w:t>拥有 4 年以上 IT 技术支持经验，经历过 Kyndryl、UPS 支持、AIA 支持项目和 Yageo 制造业 IT 环境。主要处理 Windows、Microsoft 365、账号、VPN、MFA、终端、应用和 ServiceNow 相关问题，也会把重复出现的问题整理成知识库、培训材料和更清楚的升级记录。</w:t>
+      </w:r>
+    </w:p>
+    <w:p>
+      <w:r>
+        <w:t>我的教育路径不是传统的“一路学历到办公室”。大学阶段因为工作和经济原因中断，后来通过英语自学、微软和 ITIL 认证、Kyndryl 内部学习资源，以及大量真实工单，把能力一点点补回来。进入 IT 前，我开过小饭店、做过厨师、做过外贸销售，也一对一收费教过成人英语和健身。这些经历让我更擅长把复杂问题讲清楚，也更能耐心面对压力下的用户。</w:t>
       </w:r>
     </w:p>
     <w:p>
       <w:pPr>
-        <w:spacing w:before="0" w:after="80" w:line="269" w:lineRule="auto"/>
+        <w:pStyle w:val="Heading2"/>
       </w:pPr>
       <w:r>
-        <w:rPr>
-          <w:rFonts w:ascii="Aptos" w:hAnsi="Aptos" w:eastAsia="Microsoft YaHei"/>
-          <w:b w:val="0"/>
-          <w:color w:val="2C3741"/>
-          <w:sz w:val="20"/>
-        </w:rPr>
-        <w:t>拥有 4 年以上 IT 技术支持与 Service Desk 经验，经历过 Kyndryl、UPS 支持项目和制造业 IT 客户环境。适合需要英文用户沟通、L1.5 结构化排障、ServiceNow 工单管理、Microsoft 365 / Windows 支持、知识库文档沉淀，以及 AI 辅助流程优化意识的岗位。</w:t>
-      </w:r>
-    </w:p>
-    <w:p>
-      <w:pPr>
-        <w:spacing w:before="0" w:after="80" w:line="269" w:lineRule="auto"/>
-      </w:pPr>
-      <w:r>
-        <w:rPr>
-          <w:rFonts w:ascii="Aptos" w:hAnsi="Aptos" w:eastAsia="Microsoft YaHei"/>
-          <w:b w:val="0"/>
-          <w:color w:val="2C3741"/>
-          <w:sz w:val="20"/>
-        </w:rPr>
-        <w:t>我不把自己包装成开发工程师或 AI 架构师。我的价值更接近一线：理解用户问题、把问题记录清楚、减少重复摩擦，并帮助团队把支持经验沉淀成可复用的知识和流程。</w:t>
-      </w:r>
-    </w:p>
-    <w:p>
-      <w:pPr>
-        <w:spacing w:before="160" w:after="80" w:line="259" w:lineRule="auto"/>
-        <w:pBdr>
-          <w:bottom w:val="single" w:sz="6" w:space="8" w:color="CFE1DE"/>
-        </w:pBdr>
-      </w:pPr>
-      <w:r>
-        <w:rPr>
-          <w:rFonts w:ascii="Aptos" w:hAnsi="Aptos" w:eastAsia="Microsoft YaHei"/>
-          <w:b/>
-          <w:color w:val="0D5258"/>
-          <w:sz w:val="25"/>
-        </w:rPr>
-        <w:t>适配岗位</w:t>
+        <w:t>目标岗位</w:t>
       </w:r>
     </w:p>
     <w:p>
       <w:pPr>
         <w:pStyle w:val="ListBullet"/>
-        <w:spacing w:after="50" w:line="254" w:lineRule="auto"/>
-        <w:ind w:left="238"/>
       </w:pPr>
       <w:r>
-        <w:rPr>
-          <w:rFonts w:ascii="Aptos" w:hAnsi="Aptos" w:eastAsia="Microsoft YaHei"/>
-          <w:b w:val="0"/>
-          <w:sz w:val="19"/>
-        </w:rPr>
-        <w:t>IT Service Desk Specialist / IT Support Specialist</w:t>
+        <w:t>IT Technical Support Specialist / Global IT Support Specialist</w:t>
       </w:r>
     </w:p>
     <w:p>
       <w:pPr>
         <w:pStyle w:val="ListBullet"/>
-        <w:spacing w:after="50" w:line="254" w:lineRule="auto"/>
-        <w:ind w:left="238"/>
       </w:pPr>
       <w:r>
-        <w:rPr>
-          <w:rFonts w:ascii="Aptos" w:hAnsi="Aptos" w:eastAsia="Microsoft YaHei"/>
-          <w:b w:val="0"/>
-          <w:sz w:val="19"/>
-        </w:rPr>
+        <w:t>ITSM Support Analyst / ServiceNow Support Analyst</w:t>
+      </w:r>
+    </w:p>
+    <w:p>
+      <w:pPr>
+        <w:pStyle w:val="ListBullet"/>
+      </w:pPr>
+      <w:r>
         <w:t>L1.5 / Tier 2-ready Technical Support</w:t>
       </w:r>
     </w:p>
     <w:p>
       <w:pPr>
         <w:pStyle w:val="ListBullet"/>
-        <w:spacing w:after="50" w:line="254" w:lineRule="auto"/>
-        <w:ind w:left="238"/>
       </w:pPr>
       <w:r>
-        <w:rPr>
-          <w:rFonts w:ascii="Aptos" w:hAnsi="Aptos" w:eastAsia="Microsoft YaHei"/>
-          <w:b w:val="0"/>
-          <w:sz w:val="19"/>
-        </w:rPr>
-        <w:t>ServiceNow / ITSM Support Analyst</w:t>
-      </w:r>
-    </w:p>
-    <w:p>
-      <w:pPr>
-        <w:pStyle w:val="ListBullet"/>
-        <w:spacing w:after="50" w:line="254" w:lineRule="auto"/>
-        <w:ind w:left="238"/>
-      </w:pPr>
-      <w:r>
-        <w:rPr>
-          <w:rFonts w:ascii="Aptos" w:hAnsi="Aptos" w:eastAsia="Microsoft YaHei"/>
-          <w:b w:val="0"/>
-          <w:sz w:val="19"/>
-        </w:rPr>
         <w:t>Knowledge Management / Support Documentation Specialist</w:t>
       </w:r>
     </w:p>
     <w:p>
       <w:pPr>
         <w:pStyle w:val="ListBullet"/>
-        <w:spacing w:after="50" w:line="254" w:lineRule="auto"/>
-        <w:ind w:left="238"/>
       </w:pPr>
       <w:r>
-        <w:rPr>
-          <w:rFonts w:ascii="Aptos" w:hAnsi="Aptos" w:eastAsia="Microsoft YaHei"/>
-          <w:b w:val="0"/>
-          <w:sz w:val="19"/>
-        </w:rPr>
-        <w:t>AI-assisted IT Operations / Support Automation Coordinator</w:t>
+        <w:t>AI-enabled IT Operations / Support Automation Coordinator</w:t>
       </w:r>
     </w:p>
     <w:p>
       <w:pPr>
         <w:pStyle w:val="ListBullet"/>
-        <w:spacing w:after="50" w:line="254" w:lineRule="auto"/>
-        <w:ind w:left="238"/>
       </w:pPr>
       <w:r>
-        <w:rPr>
-          <w:rFonts w:ascii="Aptos" w:hAnsi="Aptos" w:eastAsia="Microsoft YaHei"/>
-          <w:b w:val="0"/>
-          <w:sz w:val="19"/>
-        </w:rPr>
         <w:t>Manufacturing IT Support / End User Computing Support</w:t>
       </w:r>
     </w:p>
     <w:p>
       <w:pPr>
-        <w:spacing w:before="160" w:after="80" w:line="259" w:lineRule="auto"/>
-        <w:pBdr>
-          <w:bottom w:val="single" w:sz="6" w:space="8" w:color="CFE1DE"/>
-        </w:pBdr>
+        <w:pStyle w:val="Heading2"/>
       </w:pPr>
       <w:r>
-        <w:rPr>
-          <w:rFonts w:ascii="Aptos" w:hAnsi="Aptos" w:eastAsia="Microsoft YaHei"/>
-          <w:b/>
-          <w:color w:val="0D5258"/>
-          <w:sz w:val="25"/>
-        </w:rPr>
-        <w:t>核心优势</w:t>
+        <w:t>核心技能</w:t>
       </w:r>
     </w:p>
     <w:p>
       <w:pPr>
         <w:pStyle w:val="ListBullet"/>
-        <w:spacing w:after="50" w:line="254" w:lineRule="auto"/>
-        <w:ind w:left="238"/>
       </w:pPr>
       <w:r>
         <w:rPr>
-          <w:rFonts w:ascii="Aptos" w:hAnsi="Aptos" w:eastAsia="Microsoft YaHei"/>
-          <w:b w:val="0"/>
-          <w:sz w:val="19"/>
+          <w:b/>
         </w:rPr>
-        <w:t>全球用户沟通： 通过电话、邮件、Chat 和远程会话提供中英文技术支持</w:t>
+        <w:t>ITSM 与支持：</w:t>
+      </w:r>
+      <w:r>
+        <w:t xml:space="preserve"> ServiceNow、事件/请求全生命周期、ITIL 4 Foundation、SLA 意识、升级记录</w:t>
       </w:r>
     </w:p>
     <w:p>
       <w:pPr>
         <w:pStyle w:val="ListBullet"/>
-        <w:spacing w:after="50" w:line="254" w:lineRule="auto"/>
-        <w:ind w:left="238"/>
       </w:pPr>
       <w:r>
         <w:rPr>
-          <w:rFonts w:ascii="Aptos" w:hAnsi="Aptos" w:eastAsia="Microsoft YaHei"/>
-          <w:b w:val="0"/>
-          <w:sz w:val="19"/>
+          <w:b/>
         </w:rPr>
-        <w:t>L1.5 排障： Windows 10/11、Microsoft 365、Outlook、Teams、OneDrive、VPN、MFA、终端和账号访问问题</w:t>
+        <w:t>终端与 Microsoft 365：</w:t>
+      </w:r>
+      <w:r>
+        <w:t xml:space="preserve"> Windows 10/11、Outlook、Teams、OneDrive、Microsoft 365 管理基础、Active Directory、VPN、MFA</w:t>
       </w:r>
     </w:p>
     <w:p>
       <w:pPr>
         <w:pStyle w:val="ListBullet"/>
-        <w:spacing w:after="50" w:line="254" w:lineRule="auto"/>
-        <w:ind w:left="238"/>
       </w:pPr>
       <w:r>
         <w:rPr>
-          <w:rFonts w:ascii="Aptos" w:hAnsi="Aptos" w:eastAsia="Microsoft YaHei"/>
-          <w:b w:val="0"/>
-          <w:sz w:val="19"/>
+          <w:b/>
         </w:rPr>
-        <w:t>ITSM 执行： ServiceNow 事件和请求处理、升级记录、SLA 意识、根因文档</w:t>
+        <w:t>知识库与培训：</w:t>
+      </w:r>
+      <w:r>
+        <w:t xml:space="preserve"> KB 文章、新人上手材料、SOP、培训笔记、视频式操作说明、一对一辅导</w:t>
       </w:r>
     </w:p>
     <w:p>
       <w:pPr>
         <w:pStyle w:val="ListBullet"/>
-        <w:spacing w:after="50" w:line="254" w:lineRule="auto"/>
-        <w:ind w:left="238"/>
       </w:pPr>
       <w:r>
         <w:rPr>
-          <w:rFonts w:ascii="Aptos" w:hAnsi="Aptos" w:eastAsia="Microsoft YaHei"/>
-          <w:b w:val="0"/>
-          <w:sz w:val="19"/>
+          <w:b/>
         </w:rPr>
-        <w:t>账号与权限支持： Active Directory、O365 Admin Center、账号生命周期、密码重置、基础权限请求</w:t>
+        <w:t>AI 与自动化：</w:t>
+      </w:r>
+      <w:r>
+        <w:t xml:space="preserve"> Microsoft Copilot、ChatGPT、Gemini、DeepSeek、Codex CLI、AI Agent 工作流、结构化提示词、Power Automate 基础</w:t>
       </w:r>
     </w:p>
     <w:p>
       <w:pPr>
         <w:pStyle w:val="ListBullet"/>
-        <w:spacing w:after="50" w:line="254" w:lineRule="auto"/>
-        <w:ind w:left="238"/>
       </w:pPr>
       <w:r>
         <w:rPr>
-          <w:rFonts w:ascii="Aptos" w:hAnsi="Aptos" w:eastAsia="Microsoft YaHei"/>
-          <w:b w:val="0"/>
-          <w:sz w:val="19"/>
+          <w:b/>
         </w:rPr>
-        <w:t>知识沉淀： 知识库文章、项目过渡文档、新人培训材料、重复问题处理步骤</w:t>
+        <w:t>沟通：</w:t>
+      </w:r>
+      <w:r>
+        <w:t xml:space="preserve"> 英语可作为工作语言，普通话母语，可通过电话、邮件、Chat 和远程会话支持全球用户</w:t>
+      </w:r>
+    </w:p>
+    <w:p>
+      <w:pPr>
+        <w:pStyle w:val="Heading2"/>
+      </w:pPr>
+      <w:r>
+        <w:t>工作经历</w:t>
+      </w:r>
+    </w:p>
+    <w:p>
+      <w:pPr>
+        <w:pStyle w:val="Heading3"/>
+      </w:pPr>
+      <w:r>
+        <w:t>勤达睿（Kyndryl）信息科技有限公司 | 深圳 / 远程</w:t>
+      </w:r>
+    </w:p>
+    <w:p>
+      <w:r>
+        <w:rPr>
+          <w:b/>
+        </w:rPr>
+        <w:t>IT 技术支持专家，L1.5 / ServiceNow</w:t>
+      </w:r>
+      <w:r>
+        <w:t xml:space="preserve"> | 2022.04 - 至今</w:t>
+      </w:r>
+    </w:p>
+    <w:p>
+      <w:r>
+        <w:t>客户环境：Yageo 制造业 IT；AIA Service Desk 项目</w:t>
       </w:r>
     </w:p>
     <w:p>
       <w:pPr>
         <w:pStyle w:val="ListBullet"/>
-        <w:spacing w:after="50" w:line="254" w:lineRule="auto"/>
-        <w:ind w:left="238"/>
       </w:pPr>
       <w:r>
-        <w:rPr>
-          <w:rFonts w:ascii="Aptos" w:hAnsi="Aptos" w:eastAsia="Microsoft YaHei"/>
-          <w:b w:val="0"/>
-          <w:sz w:val="19"/>
-        </w:rPr>
-        <w:t>AI 辅助流程： Microsoft Copilot、结构化提示词、AI 辅助工单摘要、文档草稿、流程模板</w:t>
-      </w:r>
-    </w:p>
-    <w:p>
-      <w:pPr>
-        <w:spacing w:before="160" w:after="80" w:line="259" w:lineRule="auto"/>
-        <w:pBdr>
-          <w:bottom w:val="single" w:sz="6" w:space="8" w:color="CFE1DE"/>
-        </w:pBdr>
-      </w:pPr>
-      <w:r>
-        <w:rPr>
-          <w:rFonts w:ascii="Aptos" w:hAnsi="Aptos" w:eastAsia="Microsoft YaHei"/>
-          <w:b/>
-          <w:color w:val="0D5258"/>
-          <w:sz w:val="25"/>
-        </w:rPr>
-        <w:t>工作经历</w:t>
-      </w:r>
-    </w:p>
-    <w:p>
-      <w:pPr>
-        <w:spacing w:before="120" w:after="40" w:line="259" w:lineRule="auto"/>
-      </w:pPr>
-      <w:r>
-        <w:rPr>
-          <w:rFonts w:ascii="Aptos" w:hAnsi="Aptos" w:eastAsia="Microsoft YaHei"/>
-          <w:b/>
-          <w:color w:val="17202A"/>
-          <w:sz w:val="21"/>
-        </w:rPr>
-        <w:t>勤达睿（Kyndryl）信息科技有限公司 | 深圳 / 远程</w:t>
-      </w:r>
-    </w:p>
-    <w:p>
-      <w:pPr>
-        <w:spacing w:before="0" w:after="40" w:line="259" w:lineRule="auto"/>
-      </w:pPr>
-      <w:r>
-        <w:rPr>
-          <w:rFonts w:ascii="Aptos" w:hAnsi="Aptos" w:eastAsia="Microsoft YaHei"/>
-          <w:b w:val="0"/>
-          <w:color w:val="4C5660"/>
-          <w:sz w:val="19"/>
-        </w:rPr>
-        <w:t>IT Service Desk Specialist, Level 1.5 技术支持 | 2022.04 - 至今</w:t>
-      </w:r>
-    </w:p>
-    <w:p>
-      <w:pPr>
-        <w:spacing w:before="0" w:after="80" w:line="269" w:lineRule="auto"/>
-      </w:pPr>
-      <w:r>
-        <w:rPr>
-          <w:rFonts w:ascii="Aptos" w:hAnsi="Aptos" w:eastAsia="Microsoft YaHei"/>
-          <w:b w:val="0"/>
-          <w:color w:val="2C3741"/>
-          <w:sz w:val="20"/>
-        </w:rPr>
-        <w:t>客户环境：Yageo 制造业 IT 支持</w:t>
+        <w:t>2021 年 7 月先通过同方鼎欣进入当时 IBM / Kyndryl 支持环境做外包支持，因工作表现稳定，于 2022 年 4 月转为 Kyndryl 正式员工。</w:t>
       </w:r>
     </w:p>
     <w:p>
       <w:pPr>
         <w:pStyle w:val="ListBullet"/>
-        <w:spacing w:after="50" w:line="254" w:lineRule="auto"/>
-        <w:ind w:left="238"/>
       </w:pPr>
       <w:r>
-        <w:rPr>
-          <w:rFonts w:ascii="Aptos" w:hAnsi="Aptos" w:eastAsia="Microsoft YaHei"/>
-          <w:b w:val="0"/>
-          <w:sz w:val="19"/>
-        </w:rPr>
-        <w:t>面向制造业 IT 环境中的全球用户，通过电话、邮件、Chat 和远程会话提供英文技术支持。</w:t>
+        <w:t>面向 Yageo 全球用户，通过英文电话、邮件、Chat 和远程会话处理 Windows、Microsoft 365、VPN、MFA、账号、终端和应用问题。</w:t>
       </w:r>
     </w:p>
     <w:p>
       <w:pPr>
         <w:pStyle w:val="ListBullet"/>
-        <w:spacing w:after="50" w:line="254" w:lineRule="auto"/>
-        <w:ind w:left="238"/>
       </w:pPr>
       <w:r>
-        <w:rPr>
-          <w:rFonts w:ascii="Aptos" w:hAnsi="Aptos" w:eastAsia="Microsoft YaHei"/>
-          <w:b w:val="0"/>
-          <w:sz w:val="19"/>
-        </w:rPr>
-        <w:t>处理 Windows、Microsoft 365、VPN、MFA、账号访问、软件冲突、终端排障和常见办公效率工具问题。</w:t>
+        <w:t>使用 ServiceNow 管理事件和请求，记录清楚的排障过程、用户影响和升级信息，方便后续团队接手。</w:t>
       </w:r>
     </w:p>
     <w:p>
       <w:pPr>
         <w:pStyle w:val="ListBullet"/>
-        <w:spacing w:after="50" w:line="254" w:lineRule="auto"/>
-        <w:ind w:left="238"/>
       </w:pPr>
       <w:r>
-        <w:rPr>
-          <w:rFonts w:ascii="Aptos" w:hAnsi="Aptos" w:eastAsia="Microsoft YaHei"/>
-          <w:b w:val="0"/>
-          <w:sz w:val="19"/>
-        </w:rPr>
-        <w:t>使用 ServiceNow 管理事件和请求，记录清晰的排障过程、用户影响和升级信息，方便后续团队接手。</w:t>
+        <w:t>曾支持约一年的 AIA 友邦保险 Service Desk 项目，为一个长期运行的项目重新梳理详细知识文档、培训材料和视频式操作说明。</w:t>
       </w:r>
     </w:p>
     <w:p>
       <w:pPr>
         <w:pStyle w:val="ListBullet"/>
-        <w:spacing w:after="50" w:line="254" w:lineRule="auto"/>
-        <w:ind w:left="238"/>
       </w:pPr>
       <w:r>
-        <w:rPr>
-          <w:rFonts w:ascii="Aptos" w:hAnsi="Aptos" w:eastAsia="Microsoft YaHei"/>
-          <w:b w:val="0"/>
-          <w:sz w:val="19"/>
-        </w:rPr>
-        <w:t>支持 Active Directory 与 O365 Admin Center 相关任务，包括账号处理、访问支持、密码重置和基础权限请求。</w:t>
+        <w:t>持续根据 Yageo 的真实 incident 更新知识库。这个习惯一开始是纯人工整理，AI 普及后才逐步用于草稿、归纳和检查，并严格避免暴露公司或用户敏感数据。</w:t>
       </w:r>
     </w:p>
     <w:p>
       <w:pPr>
         <w:pStyle w:val="ListBullet"/>
-        <w:spacing w:after="50" w:line="254" w:lineRule="auto"/>
-        <w:ind w:left="238"/>
       </w:pPr>
       <w:r>
+        <w:t>使用 Microsoft Copilot、结构化提示词和本地笔记流程优化工单摘要、知识库草稿和支持清单。</w:t>
+      </w:r>
+    </w:p>
+    <w:p>
+      <w:pPr>
+        <w:pStyle w:val="Heading3"/>
+      </w:pPr>
+      <w:r>
+        <w:t>同方鼎欣科技股份有限公司（ASDC）| 深圳</w:t>
+      </w:r>
+    </w:p>
+    <w:p>
+      <w:r>
         <w:rPr>
-          <w:rFonts w:ascii="Aptos" w:hAnsi="Aptos" w:eastAsia="Microsoft YaHei"/>
-          <w:b w:val="0"/>
-          <w:sz w:val="19"/>
+          <w:b/>
         </w:rPr>
-        <w:t>创建和维护知识库文章、项目过渡文档和新人培训材料，让团队更稳定地处理重复问题。</w:t>
+        <w:t>双语技术支持代表，外派 IBM / Kyndryl UPS 项目</w:t>
+      </w:r>
+      <w:r>
+        <w:t xml:space="preserve"> | 2021.07 - 2022.04</w:t>
       </w:r>
     </w:p>
     <w:p>
       <w:pPr>
         <w:pStyle w:val="ListBullet"/>
-        <w:spacing w:after="50" w:line="254" w:lineRule="auto"/>
-        <w:ind w:left="238"/>
       </w:pPr>
       <w:r>
-        <w:rPr>
-          <w:rFonts w:ascii="Aptos" w:hAnsi="Aptos" w:eastAsia="Microsoft YaHei"/>
-          <w:b w:val="0"/>
-          <w:sz w:val="19"/>
-        </w:rPr>
-        <w:t>使用 Microsoft Copilot 与结构化提示词优化文档整理、工单摘要和排障记录，同时遵守公司数据安全边界。</w:t>
-      </w:r>
-    </w:p>
-    <w:p>
-      <w:pPr>
-        <w:spacing w:before="120" w:after="40" w:line="259" w:lineRule="auto"/>
-      </w:pPr>
-      <w:r>
-        <w:rPr>
-          <w:rFonts w:ascii="Aptos" w:hAnsi="Aptos" w:eastAsia="Microsoft YaHei"/>
-          <w:b/>
-          <w:color w:val="17202A"/>
-          <w:sz w:val="21"/>
-        </w:rPr>
-        <w:t>同方鼎欣科技股份有限公司（ASDC）| 深圳</w:t>
-      </w:r>
-    </w:p>
-    <w:p>
-      <w:pPr>
-        <w:spacing w:before="0" w:after="40" w:line="259" w:lineRule="auto"/>
-      </w:pPr>
-      <w:r>
-        <w:rPr>
-          <w:rFonts w:ascii="Aptos" w:hAnsi="Aptos" w:eastAsia="Microsoft YaHei"/>
-          <w:b w:val="0"/>
-          <w:color w:val="4C5660"/>
-          <w:sz w:val="19"/>
-        </w:rPr>
-        <w:t>技术支持代表，外派 Kyndryl / UPS 项目 | 2021.07 - 2022.04</w:t>
-      </w:r>
-    </w:p>
-    <w:p>
-      <w:pPr>
-        <w:pStyle w:val="ListBullet"/>
-        <w:spacing w:after="50" w:line="254" w:lineRule="auto"/>
-        <w:ind w:left="238"/>
-      </w:pPr>
-      <w:r>
-        <w:rPr>
-          <w:rFonts w:ascii="Aptos" w:hAnsi="Aptos" w:eastAsia="Microsoft YaHei"/>
-          <w:b w:val="0"/>
-          <w:sz w:val="19"/>
-        </w:rPr>
         <w:t>在 24/7 服务环境中，为 UPS 内部用户和外部客户提供中英文技术支持。</w:t>
       </w:r>
     </w:p>
     <w:p>
       <w:pPr>
         <w:pStyle w:val="ListBullet"/>
-        <w:spacing w:after="50" w:line="254" w:lineRule="auto"/>
-        <w:ind w:left="238"/>
       </w:pPr>
       <w:r>
-        <w:rPr>
-          <w:rFonts w:ascii="Aptos" w:hAnsi="Aptos" w:eastAsia="Microsoft YaHei"/>
-          <w:b w:val="0"/>
-          <w:sz w:val="19"/>
-        </w:rPr>
-        <w:t>在 SLA 要求内处理常见软件、硬件、账号访问和办公效率工具问题。</w:t>
+        <w:t>在 SLA 要求内处理软件、硬件、账号访问和办公效率工具问题。</w:t>
       </w:r>
     </w:p>
     <w:p>
       <w:pPr>
         <w:pStyle w:val="ListBullet"/>
-        <w:spacing w:after="50" w:line="254" w:lineRule="auto"/>
-        <w:ind w:left="238"/>
       </w:pPr>
       <w:r>
-        <w:rPr>
-          <w:rFonts w:ascii="Aptos" w:hAnsi="Aptos" w:eastAsia="Microsoft YaHei"/>
-          <w:b w:val="0"/>
-          <w:sz w:val="19"/>
-        </w:rPr>
         <w:t>将复杂问题升级至 L2/L3 团队，并提供清晰的诊断记录和用户影响背景。</w:t>
       </w:r>
     </w:p>
     <w:p>
       <w:pPr>
         <w:pStyle w:val="ListBullet"/>
-        <w:spacing w:after="50" w:line="254" w:lineRule="auto"/>
-        <w:ind w:left="238"/>
       </w:pPr>
       <w:r>
-        <w:rPr>
-          <w:rFonts w:ascii="Aptos" w:hAnsi="Aptos" w:eastAsia="Microsoft YaHei"/>
-          <w:b w:val="0"/>
-          <w:sz w:val="19"/>
-        </w:rPr>
-        <w:t>在高压电话支持中建立了耐心、稳定、清楚的问题澄清和沟通风格。</w:t>
+        <w:t>这段经历训练了电话沟通、耐心、问题澄清和书面交接能力，也为后续转为 Kyndryl 正式员工打下基础。</w:t>
       </w:r>
     </w:p>
     <w:p>
       <w:pPr>
-        <w:spacing w:before="120" w:after="40" w:line="259" w:lineRule="auto"/>
+        <w:pStyle w:val="Heading3"/>
       </w:pPr>
       <w:r>
-        <w:rPr>
-          <w:rFonts w:ascii="Aptos" w:hAnsi="Aptos" w:eastAsia="Microsoft YaHei"/>
-          <w:b/>
-          <w:color w:val="17202A"/>
-          <w:sz w:val="21"/>
-        </w:rPr>
         <w:t>深圳市亚思迈拓科技发展有限公司 | 深圳</w:t>
       </w:r>
     </w:p>
     <w:p>
-      <w:pPr>
-        <w:spacing w:before="0" w:after="40" w:line="259" w:lineRule="auto"/>
-      </w:pPr>
       <w:r>
         <w:rPr>
-          <w:rFonts w:ascii="Aptos" w:hAnsi="Aptos" w:eastAsia="Microsoft YaHei"/>
-          <w:b w:val="0"/>
-          <w:color w:val="4C5660"/>
-          <w:sz w:val="19"/>
+          <w:b/>
         </w:rPr>
-        <w:t>B2B 外贸销售代表 / 英文直播 / 店铺运营 | 2019.07 - 2021.07</w:t>
+        <w:t>B2B 外贸销售 / 英文直播 / 店铺运营</w:t>
+      </w:r>
+      <w:r>
+        <w:t xml:space="preserve"> | 2019.07 - 2021.07</w:t>
       </w:r>
     </w:p>
     <w:p>
       <w:pPr>
         <w:pStyle w:val="ListBullet"/>
-        <w:spacing w:after="50" w:line="254" w:lineRule="auto"/>
-        <w:ind w:left="238"/>
       </w:pPr>
       <w:r>
-        <w:rPr>
-          <w:rFonts w:ascii="Aptos" w:hAnsi="Aptos" w:eastAsia="Microsoft YaHei"/>
-          <w:b w:val="0"/>
-          <w:sz w:val="19"/>
-        </w:rPr>
-        <w:t>负责阿里巴巴国际站汽车电子产品的海外 B2B 销售。</w:t>
+        <w:t>负责阿里巴巴国际站汽车电子产品的海外 B2B 销售，并用英文与海外客户沟通。</w:t>
       </w:r>
     </w:p>
     <w:p>
       <w:pPr>
         <w:pStyle w:val="ListBullet"/>
-        <w:spacing w:after="50" w:line="254" w:lineRule="auto"/>
-        <w:ind w:left="238"/>
       </w:pPr>
       <w:r>
-        <w:rPr>
-          <w:rFonts w:ascii="Aptos" w:hAnsi="Aptos" w:eastAsia="Microsoft YaHei"/>
-          <w:b w:val="0"/>
-          <w:sz w:val="19"/>
-        </w:rPr>
-        <w:t>通过英文直播、书面沟通和产品讲解服务海外客户。</w:t>
+        <w:t>通过英文直播、书面跟进和产品讲解服务海外客户。</w:t>
       </w:r>
     </w:p>
     <w:p>
       <w:pPr>
         <w:pStyle w:val="ListBullet"/>
-        <w:spacing w:after="50" w:line="254" w:lineRule="auto"/>
-        <w:ind w:left="238"/>
       </w:pPr>
       <w:r>
-        <w:rPr>
-          <w:rFonts w:ascii="Aptos" w:hAnsi="Aptos" w:eastAsia="Microsoft YaHei"/>
-          <w:b w:val="0"/>
-          <w:sz w:val="19"/>
-        </w:rPr>
-        <w:t>整理标准化销售和运营步骤，沉淀客户沟通与流程文档能力，并迁移到后续 IT 支持工作中。</w:t>
+        <w:t>整理重复销售和运营步骤，形成流程文档习惯，并迁移到后续 IT 支持工作中。</w:t>
       </w:r>
     </w:p>
     <w:p>
       <w:pPr>
-        <w:spacing w:before="160" w:after="80" w:line="259" w:lineRule="auto"/>
-        <w:pBdr>
-          <w:bottom w:val="single" w:sz="6" w:space="8" w:color="CFE1DE"/>
-        </w:pBdr>
+        <w:pStyle w:val="Heading3"/>
       </w:pPr>
       <w:r>
+        <w:t>早期服务与教学经历 | 南京 / 苏州 / 深圳</w:t>
+      </w:r>
+    </w:p>
+    <w:p>
+      <w:r>
         <w:rPr>
-          <w:rFonts w:ascii="Aptos" w:hAnsi="Aptos" w:eastAsia="Microsoft YaHei"/>
           <w:b/>
-          <w:color w:val="0D5258"/>
-          <w:sz w:val="25"/>
         </w:rPr>
-        <w:t>公开证明点</w:t>
+        <w:t>小饭店经营、厨师、酒店服务、成人英语与健身一对一辅导</w:t>
+      </w:r>
+      <w:r>
+        <w:t xml:space="preserve"> | 2012 - 2019</w:t>
       </w:r>
     </w:p>
     <w:p>
       <w:pPr>
-        <w:spacing w:before="120" w:after="40" w:line="259" w:lineRule="auto"/>
+        <w:pStyle w:val="ListBullet"/>
       </w:pPr>
       <w:r>
-        <w:rPr>
-          <w:rFonts w:ascii="Aptos" w:hAnsi="Aptos" w:eastAsia="Microsoft YaHei"/>
-          <w:b/>
-          <w:color w:val="17202A"/>
-          <w:sz w:val="21"/>
-        </w:rPr>
-        <w:t>AI 辅助支持文档</w:t>
+        <w:t>开过早餐和简餐小店，也在酒店和餐饮后厨工作过，从一线服务里学习抗压和执行。</w:t>
       </w:r>
     </w:p>
     <w:p>
       <w:pPr>
-        <w:spacing w:before="0" w:after="80" w:line="269" w:lineRule="auto"/>
+        <w:pStyle w:val="ListBullet"/>
       </w:pPr>
       <w:r>
-        <w:rPr>
-          <w:rFonts w:ascii="Aptos" w:hAnsi="Aptos" w:eastAsia="Microsoft YaHei"/>
-          <w:b w:val="0"/>
-          <w:color w:val="2C3741"/>
-          <w:sz w:val="20"/>
-        </w:rPr>
-        <w:t>建立个人提示词和记录流程，把排障沟通整理成更清晰的工单摘要和知识库草稿，同时不向公开 AI 工具输入公司或用户敏感数据。</w:t>
+        <w:t>做过成人英语和健身的一对一收费辅导，训练了解释、鼓励、纠错和因人调整的方法。</w:t>
       </w:r>
     </w:p>
     <w:p>
       <w:pPr>
-        <w:spacing w:before="120" w:after="40" w:line="259" w:lineRule="auto"/>
+        <w:pStyle w:val="ListBullet"/>
       </w:pPr>
       <w:r>
-        <w:rPr>
-          <w:rFonts w:ascii="Aptos" w:hAnsi="Aptos" w:eastAsia="Microsoft YaHei"/>
-          <w:b/>
-          <w:color w:val="17202A"/>
-          <w:sz w:val="21"/>
-        </w:rPr>
-        <w:t>知识库与新人培训</w:t>
+        <w:t>这些经历不是 IT 简历的核心，但能解释我为什么适合做需要耐心、沟通和教学能力的技术支持。</w:t>
       </w:r>
     </w:p>
     <w:p>
       <w:pPr>
-        <w:spacing w:before="0" w:after="80" w:line="269" w:lineRule="auto"/>
+        <w:pStyle w:val="Heading2"/>
       </w:pPr>
       <w:r>
-        <w:rPr>
-          <w:rFonts w:ascii="Aptos" w:hAnsi="Aptos" w:eastAsia="Microsoft YaHei"/>
-          <w:b w:val="0"/>
-          <w:color w:val="2C3741"/>
-          <w:sz w:val="20"/>
-        </w:rPr>
-        <w:t>创建和维护项目过渡文档、常见问题处理步骤和新人培训材料，帮助新同事更快上手并稳定处理重复问题。</w:t>
+        <w:t>代表性工作内容</w:t>
       </w:r>
     </w:p>
     <w:p>
       <w:pPr>
-        <w:spacing w:before="120" w:after="40" w:line="259" w:lineRule="auto"/>
+        <w:pStyle w:val="Heading3"/>
       </w:pPr>
       <w:r>
-        <w:rPr>
-          <w:rFonts w:ascii="Aptos" w:hAnsi="Aptos" w:eastAsia="Microsoft YaHei"/>
-          <w:b/>
-          <w:color w:val="17202A"/>
-          <w:sz w:val="21"/>
-        </w:rPr>
-        <w:t>制造业 IT 意识</w:t>
+        <w:t>AIA 与 Yageo 知识库整理</w:t>
+      </w:r>
+    </w:p>
+    <w:p>
+      <w:r>
+        <w:t>整理 SOP、常见问题处理步骤、新人上手资料和培训内容，让长期运行的支持项目能更清楚地交接，也让重复 incident 更容易被团队稳定处理。</w:t>
       </w:r>
     </w:p>
     <w:p>
       <w:pPr>
-        <w:spacing w:before="0" w:after="80" w:line="269" w:lineRule="auto"/>
+        <w:pStyle w:val="Heading3"/>
       </w:pPr>
       <w:r>
-        <w:rPr>
-          <w:rFonts w:ascii="Aptos" w:hAnsi="Aptos" w:eastAsia="Microsoft YaHei"/>
-          <w:b w:val="0"/>
-          <w:color w:val="2C3741"/>
-          <w:sz w:val="20"/>
-        </w:rPr>
-        <w:t>具备制造业客户环境下的支持经验，逐步形成从用户影响、业务连续性和可复用支持步骤来描述 IT 问题的习惯，而不是只描述技术现象。</w:t>
+        <w:t>AI 辅助 IT 支持流程</w:t>
+      </w:r>
+    </w:p>
+    <w:p>
+      <w:r>
+        <w:t>使用 Copilot、ChatGPT 类工具、结构化提示词和本地笔记流程，整理工单摘要、知识库大纲和排障清单，同时坚持不把公司或用户敏感信息输入公开 AI 工具。</w:t>
       </w:r>
     </w:p>
     <w:p>
       <w:pPr>
-        <w:spacing w:before="160" w:after="80" w:line="259" w:lineRule="auto"/>
-        <w:pBdr>
-          <w:bottom w:val="single" w:sz="6" w:space="8" w:color="CFE1DE"/>
-        </w:pBdr>
+        <w:pStyle w:val="Heading3"/>
       </w:pPr>
       <w:r>
-        <w:rPr>
-          <w:rFonts w:ascii="Aptos" w:hAnsi="Aptos" w:eastAsia="Microsoft YaHei"/>
-          <w:b/>
-          <w:color w:val="0D5258"/>
-          <w:sz w:val="25"/>
-        </w:rPr>
+        <w:t>一对一教学式支持</w:t>
+      </w:r>
+    </w:p>
+    <w:p>
+      <w:r>
+        <w:t>成人英语和健身辅导经历让我更习惯先听懂问题，再找到卡点，用用户能听懂、能复述的方式讲下一步。</w:t>
+      </w:r>
+    </w:p>
+    <w:p>
+      <w:pPr>
+        <w:pStyle w:val="Heading2"/>
+      </w:pPr>
+      <w:r>
         <w:t>认证证书</w:t>
       </w:r>
     </w:p>
     <w:p>
       <w:pPr>
         <w:pStyle w:val="ListBullet"/>
-        <w:spacing w:after="50" w:line="254" w:lineRule="auto"/>
-        <w:ind w:left="238"/>
       </w:pPr>
       <w:r>
-        <w:rPr>
-          <w:rFonts w:ascii="Aptos" w:hAnsi="Aptos" w:eastAsia="Microsoft YaHei"/>
-          <w:b w:val="0"/>
-          <w:sz w:val="19"/>
-        </w:rPr>
         <w:t>ITIL 4 Foundation - IT 服务管理</w:t>
       </w:r>
     </w:p>
     <w:p>
       <w:pPr>
         <w:pStyle w:val="ListBullet"/>
-        <w:spacing w:after="50" w:line="254" w:lineRule="auto"/>
-        <w:ind w:left="238"/>
       </w:pPr>
       <w:r>
-        <w:rPr>
-          <w:rFonts w:ascii="Aptos" w:hAnsi="Aptos" w:eastAsia="Microsoft YaHei"/>
-          <w:b w:val="0"/>
-          <w:sz w:val="19"/>
-        </w:rPr>
         <w:t>Microsoft 365 Certified: Fundamentals</w:t>
       </w:r>
     </w:p>
     <w:p>
       <w:pPr>
         <w:pStyle w:val="ListBullet"/>
-        <w:spacing w:after="50" w:line="254" w:lineRule="auto"/>
-        <w:ind w:left="238"/>
       </w:pPr>
       <w:r>
-        <w:rPr>
-          <w:rFonts w:ascii="Aptos" w:hAnsi="Aptos" w:eastAsia="Microsoft YaHei"/>
-          <w:b w:val="0"/>
-          <w:sz w:val="19"/>
-        </w:rPr>
         <w:t>Microsoft Certified: Azure Fundamentals</w:t>
       </w:r>
     </w:p>
     <w:p>
       <w:pPr>
         <w:pStyle w:val="ListBullet"/>
-        <w:spacing w:after="50" w:line="254" w:lineRule="auto"/>
-        <w:ind w:left="238"/>
       </w:pPr>
       <w:r>
-        <w:rPr>
-          <w:rFonts w:ascii="Aptos" w:hAnsi="Aptos" w:eastAsia="Microsoft YaHei"/>
-          <w:b w:val="0"/>
-          <w:sz w:val="19"/>
-        </w:rPr>
         <w:t>Microsoft Certified: Security, Compliance, and Identity Fundamentals</w:t>
       </w:r>
     </w:p>
     <w:p>
       <w:pPr>
         <w:pStyle w:val="ListBullet"/>
-        <w:spacing w:after="50" w:line="254" w:lineRule="auto"/>
-        <w:ind w:left="238"/>
       </w:pPr>
       <w:r>
-        <w:rPr>
-          <w:rFonts w:ascii="Aptos" w:hAnsi="Aptos" w:eastAsia="Microsoft YaHei"/>
-          <w:b w:val="0"/>
-          <w:sz w:val="19"/>
-        </w:rPr>
         <w:t>Microsoft Certified: Power Platform Fundamentals</w:t>
       </w:r>
     </w:p>
     <w:p>
       <w:pPr>
         <w:pStyle w:val="ListBullet"/>
-        <w:spacing w:after="50" w:line="254" w:lineRule="auto"/>
-        <w:ind w:left="238"/>
       </w:pPr>
       <w:r>
-        <w:rPr>
-          <w:rFonts w:ascii="Aptos" w:hAnsi="Aptos" w:eastAsia="Microsoft YaHei"/>
-          <w:b w:val="0"/>
-          <w:sz w:val="19"/>
-        </w:rPr>
         <w:t>Microsoft Certified: Azure AI Fundamentals</w:t>
       </w:r>
     </w:p>
     <w:p>
       <w:pPr>
         <w:pStyle w:val="ListBullet"/>
-        <w:spacing w:after="50" w:line="254" w:lineRule="auto"/>
-        <w:ind w:left="238"/>
       </w:pPr>
       <w:r>
-        <w:rPr>
-          <w:rFonts w:ascii="Aptos" w:hAnsi="Aptos" w:eastAsia="Microsoft YaHei"/>
-          <w:b w:val="0"/>
-          <w:sz w:val="19"/>
-        </w:rPr>
         <w:t>Microsoft Certified: Azure Data Fundamentals</w:t>
       </w:r>
     </w:p>
     <w:p>
       <w:pPr>
         <w:pStyle w:val="ListBullet"/>
-        <w:spacing w:after="50" w:line="254" w:lineRule="auto"/>
-        <w:ind w:left="238"/>
       </w:pPr>
       <w:r>
-        <w:rPr>
-          <w:rFonts w:ascii="Aptos" w:hAnsi="Aptos" w:eastAsia="Microsoft YaHei"/>
-          <w:b w:val="0"/>
-          <w:sz w:val="19"/>
-        </w:rPr>
         <w:t>Microsoft Certified: Dynamics 365 Fundamentals (ERP)</w:t>
       </w:r>
     </w:p>
     <w:p>
       <w:pPr>
         <w:pStyle w:val="ListBullet"/>
-        <w:spacing w:after="50" w:line="254" w:lineRule="auto"/>
-        <w:ind w:left="238"/>
       </w:pPr>
       <w:r>
-        <w:rPr>
-          <w:rFonts w:ascii="Aptos" w:hAnsi="Aptos" w:eastAsia="Microsoft YaHei"/>
-          <w:b w:val="0"/>
-          <w:sz w:val="19"/>
-        </w:rPr>
         <w:t>Microsoft Certified: Dynamics 365 Fundamentals (CRM)</w:t>
       </w:r>
     </w:p>
     <w:p>
       <w:pPr>
         <w:pStyle w:val="ListBullet"/>
-        <w:spacing w:after="50" w:line="254" w:lineRule="auto"/>
-        <w:ind w:left="238"/>
       </w:pPr>
       <w:r>
-        <w:rPr>
-          <w:rFonts w:ascii="Aptos" w:hAnsi="Aptos" w:eastAsia="Microsoft YaHei"/>
-          <w:b w:val="0"/>
-          <w:sz w:val="19"/>
-        </w:rPr>
         <w:t>AWS Partner: Accreditation (Business)</w:t>
       </w:r>
     </w:p>
     <w:p>
       <w:pPr>
         <w:pStyle w:val="ListBullet"/>
-        <w:spacing w:after="50" w:line="254" w:lineRule="auto"/>
-        <w:ind w:left="238"/>
       </w:pPr>
       <w:r>
-        <w:rPr>
-          <w:rFonts w:ascii="Aptos" w:hAnsi="Aptos" w:eastAsia="Microsoft YaHei"/>
-          <w:b w:val="0"/>
-          <w:sz w:val="19"/>
-        </w:rPr>
         <w:t>AWS Partner: SAP on AWS (Business)</w:t>
       </w:r>
     </w:p>
     <w:p>
       <w:pPr>
-        <w:spacing w:before="160" w:after="80" w:line="259" w:lineRule="auto"/>
-        <w:pBdr>
-          <w:bottom w:val="single" w:sz="6" w:space="8" w:color="CFE1DE"/>
-        </w:pBdr>
+        <w:pStyle w:val="Heading2"/>
       </w:pPr>
       <w:r>
-        <w:rPr>
-          <w:rFonts w:ascii="Aptos" w:hAnsi="Aptos" w:eastAsia="Microsoft YaHei"/>
-          <w:b/>
-          <w:color w:val="0D5258"/>
-          <w:sz w:val="25"/>
-        </w:rPr>
-        <w:t>教育背景</w:t>
+        <w:t>教育与持续学习</w:t>
       </w:r>
     </w:p>
     <w:p>
       <w:pPr>
         <w:pStyle w:val="ListBullet"/>
-        <w:spacing w:after="50" w:line="254" w:lineRule="auto"/>
-        <w:ind w:left="238"/>
       </w:pPr>
       <w:r>
         <w:rPr>
-          <w:rFonts w:ascii="Aptos" w:hAnsi="Aptos" w:eastAsia="Microsoft YaHei"/>
-          <w:b w:val="0"/>
-          <w:sz w:val="19"/>
+          <w:b/>
         </w:rPr>
-        <w:t>广东外语外贸大学 | 英语专业，自考本科 | 在读</w:t>
+        <w:t>广东外语外贸大学</w:t>
+      </w:r>
+      <w:r>
+        <w:t xml:space="preserve"> | 英语专业，自考本科 | 在读</w:t>
       </w:r>
     </w:p>
     <w:p>
       <w:pPr>
         <w:pStyle w:val="ListBullet"/>
-        <w:spacing w:after="50" w:line="254" w:lineRule="auto"/>
-        <w:ind w:left="238"/>
       </w:pPr>
       <w:r>
         <w:rPr>
-          <w:rFonts w:ascii="Aptos" w:hAnsi="Aptos" w:eastAsia="Microsoft YaHei"/>
-          <w:b w:val="0"/>
-          <w:sz w:val="19"/>
+          <w:b/>
         </w:rPr>
-        <w:t>南京信息工程大学 | 财务管理专业 | 2011 - 2012</w:t>
+        <w:t>南京信息工程大学</w:t>
+      </w:r>
+      <w:r>
+        <w:t xml:space="preserve"> | 财务管理自考项目 | 2011 - 2012，后因工作与经济原因中断</w:t>
       </w:r>
     </w:p>
     <w:p>
       <w:pPr>
-        <w:spacing w:before="160" w:after="80" w:line="259" w:lineRule="auto"/>
-        <w:pBdr>
-          <w:bottom w:val="single" w:sz="6" w:space="8" w:color="CFE1DE"/>
-        </w:pBdr>
+        <w:pStyle w:val="ListBullet"/>
       </w:pPr>
       <w:r>
         <w:rPr>
-          <w:rFonts w:ascii="Aptos" w:hAnsi="Aptos" w:eastAsia="Microsoft YaHei"/>
           <w:b/>
-          <w:color w:val="0D5258"/>
-          <w:sz w:val="25"/>
         </w:rPr>
-        <w:t>补充背景</w:t>
+        <w:t>持续学习：</w:t>
+      </w:r>
+      <w:r>
+        <w:t xml:space="preserve"> Kyndryl 内部课程、微软认证、得到 App 用户 AZ，963 学分，得到学生证 182111265578</w:t>
       </w:r>
     </w:p>
     <w:p>
       <w:pPr>
-        <w:spacing w:before="0" w:after="80" w:line="269" w:lineRule="auto"/>
+        <w:pStyle w:val="ListBullet"/>
       </w:pPr>
       <w:r>
-        <w:rPr>
-          <w:rFonts w:ascii="Aptos" w:hAnsi="Aptos" w:eastAsia="Microsoft YaHei"/>
-          <w:b w:val="0"/>
-          <w:color w:val="2C3741"/>
-          <w:sz w:val="20"/>
-        </w:rPr>
-        <w:t>早期酒店服务、英语学习/培训、厨师和 B2B 销售经历帮助我建立了服务意识、耐心和英文沟通能力。由于目标岗位是 IT 支持，这部分只做压缩说明，不在简历中完整展开。</w:t>
+        <w:t>当前学习方向：Linux、编程与 Vibe Coding、网络安全、AI Agent 工具、日语/西班牙语/法语基础</w:t>
       </w:r>
     </w:p>
     <w:p>
       <w:pPr>
-        <w:spacing w:before="160" w:after="80" w:line="259" w:lineRule="auto"/>
-        <w:pBdr>
-          <w:bottom w:val="single" w:sz="6" w:space="8" w:color="CFE1DE"/>
-        </w:pBdr>
+        <w:pStyle w:val="Heading2"/>
       </w:pPr>
       <w:r>
-        <w:rPr>
-          <w:rFonts w:ascii="Aptos" w:hAnsi="Aptos" w:eastAsia="Microsoft YaHei"/>
-          <w:b/>
-          <w:color w:val="0D5258"/>
-          <w:sz w:val="25"/>
-        </w:rPr>
         <w:t>语言能力</w:t>
       </w:r>
     </w:p>
     <w:p>
       <w:pPr>
         <w:pStyle w:val="ListBullet"/>
-        <w:spacing w:after="50" w:line="254" w:lineRule="auto"/>
-        <w:ind w:left="238"/>
       </w:pPr>
       <w:r>
-        <w:rPr>
-          <w:rFonts w:ascii="Aptos" w:hAnsi="Aptos" w:eastAsia="Microsoft YaHei"/>
-          <w:b w:val="0"/>
-          <w:sz w:val="19"/>
-        </w:rPr>
         <w:t>普通话：母语</w:t>
       </w:r>
     </w:p>
     <w:p>
       <w:pPr>
         <w:pStyle w:val="ListBullet"/>
-        <w:spacing w:after="50" w:line="254" w:lineRule="auto"/>
-        <w:ind w:left="238"/>
       </w:pPr>
       <w:r>
-        <w:rPr>
-          <w:rFonts w:ascii="Aptos" w:hAnsi="Aptos" w:eastAsia="Microsoft YaHei"/>
-          <w:b w:val="0"/>
-          <w:sz w:val="19"/>
-        </w:rPr>
         <w:t>英语：流利，可作为工作语言</w:t>
       </w:r>
     </w:p>
     <w:sectPr>
       <w:pgSz w:w="12240" w:h="15840"/>
-      <w:pgMar w:top="765" w:right="879" w:bottom="709" w:left="879" w:header="720" w:footer="720" w:gutter="0"/>
+      <w:pgMar w:top="792" w:right="893" w:bottom="792" w:left="893" w:header="720" w:footer="720" w:gutter="0"/>
       <w:cols w:space="720"/>
       <w:docGrid w:linePitch="360"/>
     </w:sectPr>
@@ -1487,7 +1065,7 @@
       <w:outlineLvl w:val="0"/>
     </w:pPr>
     <w:rPr>
-      <w:rFonts w:asciiTheme="majorHAnsi" w:eastAsiaTheme="majorEastAsia" w:hAnsiTheme="majorHAnsi" w:cstheme="majorBidi"/>
+      <w:rFonts w:asciiTheme="majorHAnsi" w:eastAsiaTheme="majorEastAsia" w:hAnsiTheme="majorHAnsi" w:cstheme="majorBidi" w:ascii="Aptos" w:hAnsi="Aptos" w:eastAsia="Microsoft YaHei"/>
       <w:b/>
       <w:bCs/>
       <w:color w:val="365F91" w:themeColor="accent1" w:themeShade="BF"/>
@@ -1511,7 +1089,7 @@
       <w:outlineLvl w:val="1"/>
     </w:pPr>
     <w:rPr>
-      <w:rFonts w:asciiTheme="majorHAnsi" w:eastAsiaTheme="majorEastAsia" w:hAnsiTheme="majorHAnsi" w:cstheme="majorBidi"/>
+      <w:rFonts w:asciiTheme="majorHAnsi" w:eastAsiaTheme="majorEastAsia" w:hAnsiTheme="majorHAnsi" w:cstheme="majorBidi" w:ascii="Aptos" w:hAnsi="Aptos" w:eastAsia="Microsoft YaHei"/>
       <w:b/>
       <w:bCs/>
       <w:color w:val="4F81BD" w:themeColor="accent1"/>
@@ -1535,7 +1113,7 @@
       <w:outlineLvl w:val="2"/>
     </w:pPr>
     <w:rPr>
-      <w:rFonts w:asciiTheme="majorHAnsi" w:eastAsiaTheme="majorEastAsia" w:hAnsiTheme="majorHAnsi" w:cstheme="majorBidi"/>
+      <w:rFonts w:asciiTheme="majorHAnsi" w:eastAsiaTheme="majorEastAsia" w:hAnsiTheme="majorHAnsi" w:cstheme="majorBidi" w:ascii="Aptos" w:hAnsi="Aptos" w:eastAsia="Microsoft YaHei"/>
       <w:b/>
       <w:bCs/>
       <w:color w:val="4F81BD" w:themeColor="accent1"/>

</xml_diff>

<commit_message>
Update portfolio visuals and learning proof
</commit_message>
<xml_diff>
--- a/resume/Alan_Zhu_Resume_CN.docx
+++ b/resume/Alan_Zhu_Resume_CN.docx
@@ -4,7 +4,7 @@
   <w:body>
     <w:p>
       <w:pPr>
-        <w:pStyle w:val="Heading1"/>
+        <w:pStyle w:val="Title"/>
         <w:jc w:val="center"/>
       </w:pPr>
       <w:r>
@@ -12,6 +12,9 @@
       </w:r>
     </w:p>
     <w:p>
+      <w:pPr>
+        <w:spacing w:after="60"/>
+      </w:pPr>
       <w:r>
         <w:rPr>
           <w:b/>
@@ -20,41 +23,56 @@
       </w:r>
     </w:p>
     <w:p>
+      <w:pPr>
+        <w:spacing w:after="60"/>
+      </w:pPr>
       <w:r>
         <w:t>深圳，中国 | WhatsApp / Telegram：+1 460 209 9928 | 国内电话 / 微信：+86 132 6720 5713</w:t>
       </w:r>
     </w:p>
     <w:p>
+      <w:pPr>
+        <w:spacing w:after="60"/>
+      </w:pPr>
       <w:r>
         <w:t>邮箱：alan.xiaofei224@gmail.com | 备用邮箱：alan.xiaofei993@outlook.com</w:t>
       </w:r>
     </w:p>
     <w:p>
+      <w:pPr>
+        <w:spacing w:after="60"/>
+      </w:pPr>
       <w:r>
         <w:t>LinkedIn：www.linkedin.com/in/alan-zhu-221846320</w:t>
       </w:r>
     </w:p>
     <w:p>
       <w:pPr>
-        <w:pStyle w:val="Heading2"/>
+        <w:pStyle w:val="Heading1"/>
       </w:pPr>
       <w:r>
         <w:t>个人简介</w:t>
       </w:r>
     </w:p>
     <w:p>
+      <w:pPr>
+        <w:spacing w:after="60"/>
+      </w:pPr>
       <w:r>
         <w:t>拥有 4 年以上 IT 技术支持经验，经历过 Kyndryl、UPS 支持、AIA 支持项目和 Yageo 制造业 IT 环境。主要处理 Windows、Microsoft 365、账号、VPN、MFA、终端、应用和 ServiceNow 相关问题，也会把重复出现的问题整理成知识库、培训材料和更清楚的升级记录。</w:t>
       </w:r>
     </w:p>
     <w:p>
+      <w:pPr>
+        <w:spacing w:after="60"/>
+      </w:pPr>
       <w:r>
         <w:t>我的教育路径不是传统的“一路学历到办公室”。大学阶段因为工作和经济原因中断，后来通过英语自学、微软和 ITIL 认证、Kyndryl 内部学习资源，以及大量真实工单，把能力一点点补回来。进入 IT 前，我开过小饭店、做过厨师、做过外贸销售，也一对一收费教过成人英语和健身。这些经历让我更擅长把复杂问题讲清楚，也更能耐心面对压力下的用户。</w:t>
       </w:r>
     </w:p>
     <w:p>
       <w:pPr>
-        <w:pStyle w:val="Heading2"/>
+        <w:pStyle w:val="Heading1"/>
       </w:pPr>
       <w:r>
         <w:t>目标岗位</w:t>
@@ -63,6 +81,7 @@
     <w:p>
       <w:pPr>
         <w:pStyle w:val="ListBullet"/>
+        <w:spacing w:after="30"/>
       </w:pPr>
       <w:r>
         <w:t>IT Technical Support Specialist / Global IT Support Specialist</w:t>
@@ -71,6 +90,7 @@
     <w:p>
       <w:pPr>
         <w:pStyle w:val="ListBullet"/>
+        <w:spacing w:after="30"/>
       </w:pPr>
       <w:r>
         <w:t>ITSM Support Analyst / ServiceNow Support Analyst</w:t>
@@ -79,6 +99,7 @@
     <w:p>
       <w:pPr>
         <w:pStyle w:val="ListBullet"/>
+        <w:spacing w:after="30"/>
       </w:pPr>
       <w:r>
         <w:t>L1.5 / Tier 2-ready Technical Support</w:t>
@@ -87,6 +108,7 @@
     <w:p>
       <w:pPr>
         <w:pStyle w:val="ListBullet"/>
+        <w:spacing w:after="30"/>
       </w:pPr>
       <w:r>
         <w:t>Knowledge Management / Support Documentation Specialist</w:t>
@@ -95,6 +117,7 @@
     <w:p>
       <w:pPr>
         <w:pStyle w:val="ListBullet"/>
+        <w:spacing w:after="30"/>
       </w:pPr>
       <w:r>
         <w:t>AI-enabled IT Operations / Support Automation Coordinator</w:t>
@@ -103,6 +126,7 @@
     <w:p>
       <w:pPr>
         <w:pStyle w:val="ListBullet"/>
+        <w:spacing w:after="30"/>
       </w:pPr>
       <w:r>
         <w:t>Manufacturing IT Support / End User Computing Support</w:t>
@@ -110,7 +134,7 @@
     </w:p>
     <w:p>
       <w:pPr>
-        <w:pStyle w:val="Heading2"/>
+        <w:pStyle w:val="Heading1"/>
       </w:pPr>
       <w:r>
         <w:t>核心技能</w:t>
@@ -119,6 +143,7 @@
     <w:p>
       <w:pPr>
         <w:pStyle w:val="ListBullet"/>
+        <w:spacing w:after="30"/>
       </w:pPr>
       <w:r>
         <w:rPr>
@@ -133,6 +158,7 @@
     <w:p>
       <w:pPr>
         <w:pStyle w:val="ListBullet"/>
+        <w:spacing w:after="30"/>
       </w:pPr>
       <w:r>
         <w:rPr>
@@ -147,6 +173,7 @@
     <w:p>
       <w:pPr>
         <w:pStyle w:val="ListBullet"/>
+        <w:spacing w:after="30"/>
       </w:pPr>
       <w:r>
         <w:rPr>
@@ -161,6 +188,7 @@
     <w:p>
       <w:pPr>
         <w:pStyle w:val="ListBullet"/>
+        <w:spacing w:after="30"/>
       </w:pPr>
       <w:r>
         <w:rPr>
@@ -175,6 +203,7 @@
     <w:p>
       <w:pPr>
         <w:pStyle w:val="ListBullet"/>
+        <w:spacing w:after="30"/>
       </w:pPr>
       <w:r>
         <w:rPr>
@@ -188,7 +217,7 @@
     </w:p>
     <w:p>
       <w:pPr>
-        <w:pStyle w:val="Heading2"/>
+        <w:pStyle w:val="Heading1"/>
       </w:pPr>
       <w:r>
         <w:t>工作经历</w:t>
@@ -196,13 +225,16 @@
     </w:p>
     <w:p>
       <w:pPr>
-        <w:pStyle w:val="Heading3"/>
+        <w:pStyle w:val="Heading2"/>
       </w:pPr>
       <w:r>
         <w:t>勤达睿（Kyndryl）信息科技有限公司 | 深圳 / 远程</w:t>
       </w:r>
     </w:p>
     <w:p>
+      <w:pPr>
+        <w:spacing w:after="60"/>
+      </w:pPr>
       <w:r>
         <w:rPr>
           <w:b/>
@@ -214,6 +246,9 @@
       </w:r>
     </w:p>
     <w:p>
+      <w:pPr>
+        <w:spacing w:after="60"/>
+      </w:pPr>
       <w:r>
         <w:t>客户环境：Yageo 制造业 IT；AIA Service Desk 项目</w:t>
       </w:r>
@@ -221,14 +256,16 @@
     <w:p>
       <w:pPr>
         <w:pStyle w:val="ListBullet"/>
+        <w:spacing w:after="30"/>
       </w:pPr>
       <w:r>
-        <w:t>2021 年 7 月先通过同方鼎欣进入当时 IBM / Kyndryl 支持环境做外包支持，因工作表现稳定，于 2022 年 4 月转为 Kyndryl 正式员工。</w:t>
+        <w:t>2021 年 7 月通过同方鼎欣进入当时 IBM / Kyndryl 支持环境做外包支持，约 9 个月后于 2022 年 4 月转为 Kyndryl 正式员工。在当时项目环境里，这属于很快的转正节奏，也来自一线工作中的持续优秀表现。</w:t>
       </w:r>
     </w:p>
     <w:p>
       <w:pPr>
         <w:pStyle w:val="ListBullet"/>
+        <w:spacing w:after="30"/>
       </w:pPr>
       <w:r>
         <w:t>面向 Yageo 全球用户，通过英文电话、邮件、Chat 和远程会话处理 Windows、Microsoft 365、VPN、MFA、账号、终端和应用问题。</w:t>
@@ -237,6 +274,7 @@
     <w:p>
       <w:pPr>
         <w:pStyle w:val="ListBullet"/>
+        <w:spacing w:after="30"/>
       </w:pPr>
       <w:r>
         <w:t>使用 ServiceNow 管理事件和请求，记录清楚的排障过程、用户影响和升级信息，方便后续团队接手。</w:t>
@@ -245,6 +283,7 @@
     <w:p>
       <w:pPr>
         <w:pStyle w:val="ListBullet"/>
+        <w:spacing w:after="30"/>
       </w:pPr>
       <w:r>
         <w:t>曾支持约一年的 AIA 友邦保险 Service Desk 项目，为一个长期运行的项目重新梳理详细知识文档、培训材料和视频式操作说明。</w:t>
@@ -253,14 +292,16 @@
     <w:p>
       <w:pPr>
         <w:pStyle w:val="ListBullet"/>
+        <w:spacing w:after="30"/>
       </w:pPr>
       <w:r>
-        <w:t>持续根据 Yageo 的真实 incident 更新知识库。这个习惯一开始是纯人工整理，AI 普及后才逐步用于草稿、归纳和检查，并严格避免暴露公司或用户敏感数据。</w:t>
+        <w:t>持续根据 Yageo 的真实 incident 更新知识库。在 AI 普及前，我就已经手工整理 KB、交接说明和培训材料；现在则谨慎使用 AI 辅助起草、归纳和检查，并严格避免暴露公司或用户敏感数据。</w:t>
       </w:r>
     </w:p>
     <w:p>
       <w:pPr>
         <w:pStyle w:val="ListBullet"/>
+        <w:spacing w:after="30"/>
       </w:pPr>
       <w:r>
         <w:t>使用 Microsoft Copilot、结构化提示词和本地笔记流程优化工单摘要、知识库草稿和支持清单。</w:t>
@@ -268,13 +309,16 @@
     </w:p>
     <w:p>
       <w:pPr>
-        <w:pStyle w:val="Heading3"/>
+        <w:pStyle w:val="Heading2"/>
       </w:pPr>
       <w:r>
         <w:t>同方鼎欣科技股份有限公司（ASDC）| 深圳</w:t>
       </w:r>
     </w:p>
     <w:p>
+      <w:pPr>
+        <w:spacing w:after="60"/>
+      </w:pPr>
       <w:r>
         <w:rPr>
           <w:b/>
@@ -288,6 +332,7 @@
     <w:p>
       <w:pPr>
         <w:pStyle w:val="ListBullet"/>
+        <w:spacing w:after="30"/>
       </w:pPr>
       <w:r>
         <w:t>在 24/7 服务环境中，为 UPS 内部用户和外部客户提供中英文技术支持。</w:t>
@@ -296,6 +341,7 @@
     <w:p>
       <w:pPr>
         <w:pStyle w:val="ListBullet"/>
+        <w:spacing w:after="30"/>
       </w:pPr>
       <w:r>
         <w:t>在 SLA 要求内处理软件、硬件、账号访问和办公效率工具问题。</w:t>
@@ -304,6 +350,7 @@
     <w:p>
       <w:pPr>
         <w:pStyle w:val="ListBullet"/>
+        <w:spacing w:after="30"/>
       </w:pPr>
       <w:r>
         <w:t>将复杂问题升级至 L2/L3 团队，并提供清晰的诊断记录和用户影响背景。</w:t>
@@ -312,6 +359,7 @@
     <w:p>
       <w:pPr>
         <w:pStyle w:val="ListBullet"/>
+        <w:spacing w:after="30"/>
       </w:pPr>
       <w:r>
         <w:t>这段经历训练了电话沟通、耐心、问题澄清和书面交接能力，也为后续转为 Kyndryl 正式员工打下基础。</w:t>
@@ -319,13 +367,16 @@
     </w:p>
     <w:p>
       <w:pPr>
-        <w:pStyle w:val="Heading3"/>
+        <w:pStyle w:val="Heading2"/>
       </w:pPr>
       <w:r>
         <w:t>深圳市亚思迈拓科技发展有限公司 | 深圳</w:t>
       </w:r>
     </w:p>
     <w:p>
+      <w:pPr>
+        <w:spacing w:after="60"/>
+      </w:pPr>
       <w:r>
         <w:rPr>
           <w:b/>
@@ -339,6 +390,7 @@
     <w:p>
       <w:pPr>
         <w:pStyle w:val="ListBullet"/>
+        <w:spacing w:after="30"/>
       </w:pPr>
       <w:r>
         <w:t>负责阿里巴巴国际站汽车电子产品的海外 B2B 销售，并用英文与海外客户沟通。</w:t>
@@ -347,6 +399,7 @@
     <w:p>
       <w:pPr>
         <w:pStyle w:val="ListBullet"/>
+        <w:spacing w:after="30"/>
       </w:pPr>
       <w:r>
         <w:t>通过英文直播、书面跟进和产品讲解服务海外客户。</w:t>
@@ -355,6 +408,7 @@
     <w:p>
       <w:pPr>
         <w:pStyle w:val="ListBullet"/>
+        <w:spacing w:after="30"/>
       </w:pPr>
       <w:r>
         <w:t>整理重复销售和运营步骤，形成流程文档习惯，并迁移到后续 IT 支持工作中。</w:t>
@@ -362,13 +416,16 @@
     </w:p>
     <w:p>
       <w:pPr>
-        <w:pStyle w:val="Heading3"/>
+        <w:pStyle w:val="Heading2"/>
       </w:pPr>
       <w:r>
         <w:t>早期服务与教学经历 | 南京 / 苏州 / 深圳</w:t>
       </w:r>
     </w:p>
     <w:p>
+      <w:pPr>
+        <w:spacing w:after="60"/>
+      </w:pPr>
       <w:r>
         <w:rPr>
           <w:b/>
@@ -382,6 +439,7 @@
     <w:p>
       <w:pPr>
         <w:pStyle w:val="ListBullet"/>
+        <w:spacing w:after="30"/>
       </w:pPr>
       <w:r>
         <w:t>开过早餐和简餐小店，也在酒店和餐饮后厨工作过，从一线服务里学习抗压和执行。</w:t>
@@ -390,6 +448,7 @@
     <w:p>
       <w:pPr>
         <w:pStyle w:val="ListBullet"/>
+        <w:spacing w:after="30"/>
       </w:pPr>
       <w:r>
         <w:t>做过成人英语和健身的一对一收费辅导，训练了解释、鼓励、纠错和因人调整的方法。</w:t>
@@ -398,6 +457,7 @@
     <w:p>
       <w:pPr>
         <w:pStyle w:val="ListBullet"/>
+        <w:spacing w:after="30"/>
       </w:pPr>
       <w:r>
         <w:t>这些经历不是 IT 简历的核心，但能解释我为什么适合做需要耐心、沟通和教学能力的技术支持。</w:t>
@@ -405,7 +465,7 @@
     </w:p>
     <w:p>
       <w:pPr>
-        <w:pStyle w:val="Heading2"/>
+        <w:pStyle w:val="Heading1"/>
       </w:pPr>
       <w:r>
         <w:t>代表性工作内容</w:t>
@@ -413,46 +473,55 @@
     </w:p>
     <w:p>
       <w:pPr>
-        <w:pStyle w:val="Heading3"/>
+        <w:pStyle w:val="Heading2"/>
       </w:pPr>
       <w:r>
         <w:t>AIA 与 Yageo 知识库整理</w:t>
       </w:r>
     </w:p>
     <w:p>
+      <w:pPr>
+        <w:spacing w:after="60"/>
+      </w:pPr>
       <w:r>
         <w:t>整理 SOP、常见问题处理步骤、新人上手资料和培训内容，让长期运行的支持项目能更清楚地交接，也让重复 incident 更容易被团队稳定处理。</w:t>
       </w:r>
     </w:p>
     <w:p>
       <w:pPr>
-        <w:pStyle w:val="Heading3"/>
+        <w:pStyle w:val="Heading2"/>
       </w:pPr>
       <w:r>
         <w:t>AI 辅助 IT 支持流程</w:t>
       </w:r>
     </w:p>
     <w:p>
+      <w:pPr>
+        <w:spacing w:after="60"/>
+      </w:pPr>
       <w:r>
         <w:t>使用 Copilot、ChatGPT 类工具、结构化提示词和本地笔记流程，整理工单摘要、知识库大纲和排障清单，同时坚持不把公司或用户敏感信息输入公开 AI 工具。</w:t>
       </w:r>
     </w:p>
     <w:p>
       <w:pPr>
-        <w:pStyle w:val="Heading3"/>
+        <w:pStyle w:val="Heading2"/>
       </w:pPr>
       <w:r>
         <w:t>一对一教学式支持</w:t>
       </w:r>
     </w:p>
     <w:p>
+      <w:pPr>
+        <w:spacing w:after="60"/>
+      </w:pPr>
       <w:r>
         <w:t>成人英语和健身辅导经历让我更习惯先听懂问题，再找到卡点，用用户能听懂、能复述的方式讲下一步。</w:t>
       </w:r>
     </w:p>
     <w:p>
       <w:pPr>
-        <w:pStyle w:val="Heading2"/>
+        <w:pStyle w:val="Heading1"/>
       </w:pPr>
       <w:r>
         <w:t>认证证书</w:t>
@@ -461,6 +530,7 @@
     <w:p>
       <w:pPr>
         <w:pStyle w:val="ListBullet"/>
+        <w:spacing w:after="30"/>
       </w:pPr>
       <w:r>
         <w:t>ITIL 4 Foundation - IT 服务管理</w:t>
@@ -469,6 +539,7 @@
     <w:p>
       <w:pPr>
         <w:pStyle w:val="ListBullet"/>
+        <w:spacing w:after="30"/>
       </w:pPr>
       <w:r>
         <w:t>Microsoft 365 Certified: Fundamentals</w:t>
@@ -477,6 +548,7 @@
     <w:p>
       <w:pPr>
         <w:pStyle w:val="ListBullet"/>
+        <w:spacing w:after="30"/>
       </w:pPr>
       <w:r>
         <w:t>Microsoft Certified: Azure Fundamentals</w:t>
@@ -485,6 +557,7 @@
     <w:p>
       <w:pPr>
         <w:pStyle w:val="ListBullet"/>
+        <w:spacing w:after="30"/>
       </w:pPr>
       <w:r>
         <w:t>Microsoft Certified: Security, Compliance, and Identity Fundamentals</w:t>
@@ -493,6 +566,7 @@
     <w:p>
       <w:pPr>
         <w:pStyle w:val="ListBullet"/>
+        <w:spacing w:after="30"/>
       </w:pPr>
       <w:r>
         <w:t>Microsoft Certified: Power Platform Fundamentals</w:t>
@@ -501,6 +575,7 @@
     <w:p>
       <w:pPr>
         <w:pStyle w:val="ListBullet"/>
+        <w:spacing w:after="30"/>
       </w:pPr>
       <w:r>
         <w:t>Microsoft Certified: Azure AI Fundamentals</w:t>
@@ -509,6 +584,7 @@
     <w:p>
       <w:pPr>
         <w:pStyle w:val="ListBullet"/>
+        <w:spacing w:after="30"/>
       </w:pPr>
       <w:r>
         <w:t>Microsoft Certified: Azure Data Fundamentals</w:t>
@@ -517,6 +593,7 @@
     <w:p>
       <w:pPr>
         <w:pStyle w:val="ListBullet"/>
+        <w:spacing w:after="30"/>
       </w:pPr>
       <w:r>
         <w:t>Microsoft Certified: Dynamics 365 Fundamentals (ERP)</w:t>
@@ -525,6 +602,7 @@
     <w:p>
       <w:pPr>
         <w:pStyle w:val="ListBullet"/>
+        <w:spacing w:after="30"/>
       </w:pPr>
       <w:r>
         <w:t>Microsoft Certified: Dynamics 365 Fundamentals (CRM)</w:t>
@@ -533,6 +611,7 @@
     <w:p>
       <w:pPr>
         <w:pStyle w:val="ListBullet"/>
+        <w:spacing w:after="30"/>
       </w:pPr>
       <w:r>
         <w:t>AWS Partner: Accreditation (Business)</w:t>
@@ -541,6 +620,7 @@
     <w:p>
       <w:pPr>
         <w:pStyle w:val="ListBullet"/>
+        <w:spacing w:after="30"/>
       </w:pPr>
       <w:r>
         <w:t>AWS Partner: SAP on AWS (Business)</w:t>
@@ -548,7 +628,7 @@
     </w:p>
     <w:p>
       <w:pPr>
-        <w:pStyle w:val="Heading2"/>
+        <w:pStyle w:val="Heading1"/>
       </w:pPr>
       <w:r>
         <w:t>教育与持续学习</w:t>
@@ -557,6 +637,7 @@
     <w:p>
       <w:pPr>
         <w:pStyle w:val="ListBullet"/>
+        <w:spacing w:after="30"/>
       </w:pPr>
       <w:r>
         <w:rPr>
@@ -571,6 +652,7 @@
     <w:p>
       <w:pPr>
         <w:pStyle w:val="ListBullet"/>
+        <w:spacing w:after="30"/>
       </w:pPr>
       <w:r>
         <w:rPr>
@@ -585,6 +667,7 @@
     <w:p>
       <w:pPr>
         <w:pStyle w:val="ListBullet"/>
+        <w:spacing w:after="30"/>
       </w:pPr>
       <w:r>
         <w:rPr>
@@ -599,6 +682,7 @@
     <w:p>
       <w:pPr>
         <w:pStyle w:val="ListBullet"/>
+        <w:spacing w:after="30"/>
       </w:pPr>
       <w:r>
         <w:t>当前学习方向：Linux、编程与 Vibe Coding、网络安全、AI Agent 工具、日语/西班牙语/法语基础</w:t>
@@ -606,7 +690,7 @@
     </w:p>
     <w:p>
       <w:pPr>
-        <w:pStyle w:val="Heading2"/>
+        <w:pStyle w:val="Heading1"/>
       </w:pPr>
       <w:r>
         <w:t>语言能力</w:t>
@@ -615,6 +699,7 @@
     <w:p>
       <w:pPr>
         <w:pStyle w:val="ListBullet"/>
+        <w:spacing w:after="30"/>
       </w:pPr>
       <w:r>
         <w:t>普通话：母语</w:t>
@@ -623,6 +708,7 @@
     <w:p>
       <w:pPr>
         <w:pStyle w:val="ListBullet"/>
+        <w:spacing w:after="30"/>
       </w:pPr>
       <w:r>
         <w:t>英语：流利，可作为工作语言</w:t>
@@ -1002,8 +1088,8 @@
     <w:qFormat/>
     <w:rsid w:val="00FC693F"/>
     <w:rPr>
-      <w:rFonts w:ascii="Aptos" w:hAnsi="Aptos" w:eastAsia="Microsoft YaHei"/>
-      <w:sz w:val="20"/>
+      <w:rFonts w:ascii="Arial" w:hAnsi="Arial"/>
+      <w:sz w:val="19"/>
     </w:rPr>
   </w:style>
   <w:style w:type="paragraph" w:styleId="Header">
@@ -1065,7 +1151,7 @@
       <w:outlineLvl w:val="0"/>
     </w:pPr>
     <w:rPr>
-      <w:rFonts w:asciiTheme="majorHAnsi" w:eastAsiaTheme="majorEastAsia" w:hAnsiTheme="majorHAnsi" w:cstheme="majorBidi" w:ascii="Aptos" w:hAnsi="Aptos" w:eastAsia="Microsoft YaHei"/>
+      <w:rFonts w:asciiTheme="majorHAnsi" w:eastAsiaTheme="majorEastAsia" w:hAnsiTheme="majorHAnsi" w:cstheme="majorBidi" w:ascii="Arial" w:hAnsi="Arial"/>
       <w:b/>
       <w:bCs/>
       <w:color w:val="365F91" w:themeColor="accent1" w:themeShade="BF"/>
@@ -1089,11 +1175,11 @@
       <w:outlineLvl w:val="1"/>
     </w:pPr>
     <w:rPr>
-      <w:rFonts w:asciiTheme="majorHAnsi" w:eastAsiaTheme="majorEastAsia" w:hAnsiTheme="majorHAnsi" w:cstheme="majorBidi" w:ascii="Aptos" w:hAnsi="Aptos" w:eastAsia="Microsoft YaHei"/>
+      <w:rFonts w:asciiTheme="majorHAnsi" w:eastAsiaTheme="majorEastAsia" w:hAnsiTheme="majorHAnsi" w:cstheme="majorBidi" w:ascii="Arial" w:hAnsi="Arial"/>
       <w:b/>
       <w:bCs/>
       <w:color w:val="4F81BD" w:themeColor="accent1"/>
-      <w:sz w:val="26"/>
+      <w:sz w:val="24"/>
       <w:szCs w:val="26"/>
     </w:rPr>
   </w:style>
@@ -1113,10 +1199,11 @@
       <w:outlineLvl w:val="2"/>
     </w:pPr>
     <w:rPr>
-      <w:rFonts w:asciiTheme="majorHAnsi" w:eastAsiaTheme="majorEastAsia" w:hAnsiTheme="majorHAnsi" w:cstheme="majorBidi" w:ascii="Aptos" w:hAnsi="Aptos" w:eastAsia="Microsoft YaHei"/>
+      <w:rFonts w:asciiTheme="majorHAnsi" w:eastAsiaTheme="majorEastAsia" w:hAnsiTheme="majorHAnsi" w:cstheme="majorBidi" w:ascii="Arial" w:hAnsi="Arial"/>
       <w:b/>
       <w:bCs/>
       <w:color w:val="4F81BD" w:themeColor="accent1"/>
+      <w:sz w:val="21"/>
     </w:rPr>
   </w:style>
   <w:style w:type="paragraph" w:styleId="Heading4">
@@ -1354,11 +1441,11 @@
       <w:contextualSpacing/>
     </w:pPr>
     <w:rPr>
-      <w:rFonts w:asciiTheme="majorHAnsi" w:eastAsiaTheme="majorEastAsia" w:hAnsiTheme="majorHAnsi" w:cstheme="majorBidi"/>
+      <w:rFonts w:asciiTheme="majorHAnsi" w:eastAsiaTheme="majorEastAsia" w:hAnsiTheme="majorHAnsi" w:cstheme="majorBidi" w:ascii="Arial" w:hAnsi="Arial"/>
       <w:color w:val="17365D" w:themeColor="text2" w:themeShade="BF"/>
       <w:spacing w:val="5"/>
       <w:kern w:val="28"/>
-      <w:sz w:val="52"/>
+      <w:sz w:val="36"/>
       <w:szCs w:val="52"/>
     </w:rPr>
   </w:style>

</xml_diff>

<commit_message>
Publish portfolio chat and proof updates
</commit_message>
<xml_diff>
--- a/resume/Alan_Zhu_Resume_CN.docx
+++ b/resume/Alan_Zhu_Resume_CN.docx
@@ -4,719 +4,1112 @@
   <w:body>
     <w:p>
       <w:pPr>
-        <w:pStyle w:val="Title"/>
-        <w:jc w:val="center"/>
+        <w:spacing w:after="60"/>
+        <w:jc w:val="left"/>
       </w:pPr>
       <w:r>
+        <w:rPr>
+          <w:rFonts w:ascii="Aptos" w:hAnsi="Aptos" w:eastAsia="Microsoft YaHei"/>
+          <w:b/>
+          <w:color w:val="0D5258"/>
+          <w:sz w:val="42"/>
+        </w:rPr>
         <w:t>朱正飞（Alan Zhu）</w:t>
       </w:r>
     </w:p>
     <w:p>
       <w:pPr>
-        <w:spacing w:after="60"/>
+        <w:spacing w:before="0" w:after="40" w:line="259" w:lineRule="auto"/>
       </w:pPr>
       <w:r>
         <w:rPr>
-          <w:b/>
+          <w:rFonts w:ascii="Aptos" w:hAnsi="Aptos" w:eastAsia="Microsoft YaHei"/>
+          <w:b w:val="0"/>
+          <w:color w:val="4C5660"/>
+          <w:sz w:val="19"/>
         </w:rPr>
         <w:t>双语 IT 技术支持专家 | ITSM Support Analyst | Microsoft 365 / ServiceNow / 知识管理 | AI 辅助支持流程</w:t>
       </w:r>
     </w:p>
     <w:p>
       <w:pPr>
-        <w:spacing w:after="60"/>
+        <w:spacing w:before="0" w:after="40" w:line="259" w:lineRule="auto"/>
       </w:pPr>
       <w:r>
-        <w:t>深圳，中国 | WhatsApp / Telegram：+1 460 209 9928 | 国内电话 / 微信：+86 132 6720 5713</w:t>
+        <w:rPr>
+          <w:rFonts w:ascii="Aptos" w:hAnsi="Aptos" w:eastAsia="Microsoft YaHei"/>
+          <w:b w:val="0"/>
+          <w:color w:val="4C5660"/>
+          <w:sz w:val="19"/>
+        </w:rPr>
+        <w:t>深圳，中国 | 1993年8月生 | WhatsApp / Telegram：+1 460 209 9928 | 国内电话 / 微信：+86 132 6720 5713</w:t>
       </w:r>
     </w:p>
     <w:p>
       <w:pPr>
-        <w:spacing w:after="60"/>
+        <w:spacing w:before="0" w:after="80" w:line="269" w:lineRule="auto"/>
       </w:pPr>
       <w:r>
+        <w:rPr>
+          <w:rFonts w:ascii="Aptos" w:hAnsi="Aptos" w:eastAsia="Microsoft YaHei"/>
+          <w:b w:val="0"/>
+          <w:color w:val="2C3741"/>
+          <w:sz w:val="20"/>
+        </w:rPr>
         <w:t>邮箱：alan.xiaofei224@gmail.com | 备用邮箱：alan.xiaofei993@outlook.com</w:t>
       </w:r>
     </w:p>
     <w:p>
       <w:pPr>
-        <w:spacing w:after="60"/>
+        <w:spacing w:before="0" w:after="80" w:line="269" w:lineRule="auto"/>
       </w:pPr>
       <w:r>
+        <w:rPr>
+          <w:rFonts w:ascii="Aptos" w:hAnsi="Aptos" w:eastAsia="Microsoft YaHei"/>
+          <w:b w:val="0"/>
+          <w:color w:val="2C3741"/>
+          <w:sz w:val="20"/>
+        </w:rPr>
         <w:t>LinkedIn：www.linkedin.com/in/alan-zhu-221846320</w:t>
       </w:r>
     </w:p>
     <w:p>
       <w:pPr>
-        <w:pStyle w:val="Heading1"/>
+        <w:spacing w:before="160" w:after="80" w:line="259" w:lineRule="auto"/>
+        <w:pBdr>
+          <w:bottom w:val="single" w:sz="6" w:space="8" w:color="CFE1DE"/>
+        </w:pBdr>
       </w:pPr>
       <w:r>
+        <w:rPr>
+          <w:rFonts w:ascii="Aptos" w:hAnsi="Aptos" w:eastAsia="Microsoft YaHei"/>
+          <w:b/>
+          <w:color w:val="0D5258"/>
+          <w:sz w:val="25"/>
+        </w:rPr>
         <w:t>个人简介</w:t>
       </w:r>
     </w:p>
     <w:p>
       <w:pPr>
-        <w:spacing w:after="60"/>
+        <w:spacing w:before="0" w:after="80" w:line="269" w:lineRule="auto"/>
       </w:pPr>
       <w:r>
+        <w:rPr>
+          <w:rFonts w:ascii="Aptos" w:hAnsi="Aptos" w:eastAsia="Microsoft YaHei"/>
+          <w:b w:val="0"/>
+          <w:color w:val="2C3741"/>
+          <w:sz w:val="20"/>
+        </w:rPr>
         <w:t>拥有 4 年以上 IT 技术支持经验，经历过 Kyndryl、UPS 支持、AIA 支持项目和 Yageo 制造业 IT 环境。主要处理 Windows、Microsoft 365、账号、VPN、MFA、终端、应用和 ServiceNow 相关问题，也会把重复出现的问题整理成知识库、培训材料和更清楚的升级记录。</w:t>
       </w:r>
     </w:p>
     <w:p>
       <w:pPr>
-        <w:spacing w:after="60"/>
+        <w:spacing w:before="0" w:after="80" w:line="269" w:lineRule="auto"/>
       </w:pPr>
       <w:r>
-        <w:t>我的教育路径不是传统的“一路学历到办公室”。大学阶段因为工作和经济原因中断，后来通过英语自学、微软和 ITIL 认证、Kyndryl 内部学习资源，以及大量真实工单，把能力一点点补回来。进入 IT 前，我开过小饭店、做过厨师、做过外贸销售，也一对一收费教过成人英语和健身。这些经历让我更擅长把复杂问题讲清楚，也更能耐心面对压力下的用户。</w:t>
+        <w:rPr>
+          <w:rFonts w:ascii="Aptos" w:hAnsi="Aptos" w:eastAsia="Microsoft YaHei"/>
+          <w:b w:val="0"/>
+          <w:color w:val="2C3741"/>
+          <w:sz w:val="20"/>
+        </w:rPr>
+        <w:t>我的 IT 职业路径建立在持续自学、认证学习和真实支持经验之上，也来自更早期的服务、销售、教学和辅导经历。进入 IT 前，我开过小饭店、做过厨师、做过外贸销售，也一对一收费教过成人英语和健身。这些经历让我能在压力下保持冷静，把技术步骤讲清楚，并在环境变化时继续学习。</w:t>
       </w:r>
     </w:p>
     <w:p>
       <w:pPr>
-        <w:pStyle w:val="Heading1"/>
+        <w:spacing w:before="160" w:after="80" w:line="259" w:lineRule="auto"/>
+        <w:pBdr>
+          <w:bottom w:val="single" w:sz="6" w:space="8" w:color="CFE1DE"/>
+        </w:pBdr>
       </w:pPr>
       <w:r>
+        <w:rPr>
+          <w:rFonts w:ascii="Aptos" w:hAnsi="Aptos" w:eastAsia="Microsoft YaHei"/>
+          <w:b/>
+          <w:color w:val="0D5258"/>
+          <w:sz w:val="25"/>
+        </w:rPr>
         <w:t>目标岗位</w:t>
       </w:r>
     </w:p>
     <w:p>
       <w:pPr>
         <w:pStyle w:val="ListBullet"/>
-        <w:spacing w:after="30"/>
+        <w:spacing w:after="50" w:line="254" w:lineRule="auto"/>
+        <w:ind w:left="238"/>
       </w:pPr>
       <w:r>
+        <w:rPr>
+          <w:rFonts w:ascii="Aptos" w:hAnsi="Aptos" w:eastAsia="Microsoft YaHei"/>
+          <w:b w:val="0"/>
+          <w:sz w:val="19"/>
+        </w:rPr>
         <w:t>IT Technical Support Specialist / Global IT Support Specialist</w:t>
       </w:r>
     </w:p>
     <w:p>
       <w:pPr>
         <w:pStyle w:val="ListBullet"/>
-        <w:spacing w:after="30"/>
+        <w:spacing w:after="50" w:line="254" w:lineRule="auto"/>
+        <w:ind w:left="238"/>
       </w:pPr>
       <w:r>
+        <w:rPr>
+          <w:rFonts w:ascii="Aptos" w:hAnsi="Aptos" w:eastAsia="Microsoft YaHei"/>
+          <w:b w:val="0"/>
+          <w:sz w:val="19"/>
+        </w:rPr>
         <w:t>ITSM Support Analyst / ServiceNow Support Analyst</w:t>
       </w:r>
     </w:p>
     <w:p>
       <w:pPr>
         <w:pStyle w:val="ListBullet"/>
-        <w:spacing w:after="30"/>
+        <w:spacing w:after="50" w:line="254" w:lineRule="auto"/>
+        <w:ind w:left="238"/>
       </w:pPr>
       <w:r>
+        <w:rPr>
+          <w:rFonts w:ascii="Aptos" w:hAnsi="Aptos" w:eastAsia="Microsoft YaHei"/>
+          <w:b w:val="0"/>
+          <w:sz w:val="19"/>
+        </w:rPr>
         <w:t>L1.5 / Tier 2-ready Technical Support</w:t>
       </w:r>
     </w:p>
     <w:p>
       <w:pPr>
         <w:pStyle w:val="ListBullet"/>
-        <w:spacing w:after="30"/>
+        <w:spacing w:after="50" w:line="254" w:lineRule="auto"/>
+        <w:ind w:left="238"/>
       </w:pPr>
       <w:r>
+        <w:rPr>
+          <w:rFonts w:ascii="Aptos" w:hAnsi="Aptos" w:eastAsia="Microsoft YaHei"/>
+          <w:b w:val="0"/>
+          <w:sz w:val="19"/>
+        </w:rPr>
         <w:t>Knowledge Management / Support Documentation Specialist</w:t>
       </w:r>
     </w:p>
     <w:p>
       <w:pPr>
         <w:pStyle w:val="ListBullet"/>
-        <w:spacing w:after="30"/>
+        <w:spacing w:after="50" w:line="254" w:lineRule="auto"/>
+        <w:ind w:left="238"/>
       </w:pPr>
       <w:r>
+        <w:rPr>
+          <w:rFonts w:ascii="Aptos" w:hAnsi="Aptos" w:eastAsia="Microsoft YaHei"/>
+          <w:b w:val="0"/>
+          <w:sz w:val="19"/>
+        </w:rPr>
         <w:t>AI-enabled IT Operations / Support Automation Coordinator</w:t>
       </w:r>
     </w:p>
     <w:p>
       <w:pPr>
         <w:pStyle w:val="ListBullet"/>
-        <w:spacing w:after="30"/>
+        <w:spacing w:after="50" w:line="254" w:lineRule="auto"/>
+        <w:ind w:left="238"/>
       </w:pPr>
       <w:r>
+        <w:rPr>
+          <w:rFonts w:ascii="Aptos" w:hAnsi="Aptos" w:eastAsia="Microsoft YaHei"/>
+          <w:b w:val="0"/>
+          <w:sz w:val="19"/>
+        </w:rPr>
         <w:t>Manufacturing IT Support / End User Computing Support</w:t>
       </w:r>
     </w:p>
     <w:p>
       <w:pPr>
-        <w:pStyle w:val="Heading1"/>
+        <w:spacing w:before="160" w:after="80" w:line="259" w:lineRule="auto"/>
+        <w:pBdr>
+          <w:bottom w:val="single" w:sz="6" w:space="8" w:color="CFE1DE"/>
+        </w:pBdr>
       </w:pPr>
       <w:r>
+        <w:rPr>
+          <w:rFonts w:ascii="Aptos" w:hAnsi="Aptos" w:eastAsia="Microsoft YaHei"/>
+          <w:b/>
+          <w:color w:val="0D5258"/>
+          <w:sz w:val="25"/>
+        </w:rPr>
         <w:t>核心技能</w:t>
       </w:r>
     </w:p>
     <w:p>
       <w:pPr>
         <w:pStyle w:val="ListBullet"/>
-        <w:spacing w:after="30"/>
+        <w:spacing w:after="50" w:line="254" w:lineRule="auto"/>
+        <w:ind w:left="238"/>
       </w:pPr>
       <w:r>
         <w:rPr>
-          <w:b/>
+          <w:rFonts w:ascii="Aptos" w:hAnsi="Aptos" w:eastAsia="Microsoft YaHei"/>
+          <w:b w:val="0"/>
+          <w:sz w:val="19"/>
         </w:rPr>
-        <w:t>ITSM 与支持：</w:t>
-      </w:r>
-      <w:r>
-        <w:t xml:space="preserve"> ServiceNow、事件/请求全生命周期、ITIL 4 Foundation、SLA 意识、升级记录</w:t>
+        <w:t>ITSM 与支持： ServiceNow、事件/请求全生命周期、ITIL 4 Foundation、SLA 意识、升级记录</w:t>
       </w:r>
     </w:p>
     <w:p>
       <w:pPr>
         <w:pStyle w:val="ListBullet"/>
-        <w:spacing w:after="30"/>
+        <w:spacing w:after="50" w:line="254" w:lineRule="auto"/>
+        <w:ind w:left="238"/>
       </w:pPr>
       <w:r>
         <w:rPr>
-          <w:b/>
+          <w:rFonts w:ascii="Aptos" w:hAnsi="Aptos" w:eastAsia="Microsoft YaHei"/>
+          <w:b w:val="0"/>
+          <w:sz w:val="19"/>
         </w:rPr>
-        <w:t>终端与 Microsoft 365：</w:t>
-      </w:r>
-      <w:r>
-        <w:t xml:space="preserve"> Windows 10/11、Outlook、Teams、OneDrive、Microsoft 365 管理基础、Active Directory、VPN、MFA</w:t>
+        <w:t>终端与 Microsoft 365： Windows 10/11、Outlook、Teams、OneDrive、Microsoft 365 管理基础、Active Directory、VPN、MFA</w:t>
       </w:r>
     </w:p>
     <w:p>
       <w:pPr>
         <w:pStyle w:val="ListBullet"/>
-        <w:spacing w:after="30"/>
+        <w:spacing w:after="50" w:line="254" w:lineRule="auto"/>
+        <w:ind w:left="238"/>
       </w:pPr>
       <w:r>
         <w:rPr>
-          <w:b/>
+          <w:rFonts w:ascii="Aptos" w:hAnsi="Aptos" w:eastAsia="Microsoft YaHei"/>
+          <w:b w:val="0"/>
+          <w:sz w:val="19"/>
         </w:rPr>
-        <w:t>知识库与培训：</w:t>
-      </w:r>
-      <w:r>
-        <w:t xml:space="preserve"> KB 文章、新人上手材料、SOP、培训笔记、视频式操作说明、一对一辅导</w:t>
+        <w:t>知识库与培训： KB 文章、新人上手材料、SOP、培训笔记、视频式操作说明、一对一辅导</w:t>
       </w:r>
     </w:p>
     <w:p>
       <w:pPr>
         <w:pStyle w:val="ListBullet"/>
-        <w:spacing w:after="30"/>
+        <w:spacing w:after="50" w:line="254" w:lineRule="auto"/>
+        <w:ind w:left="238"/>
       </w:pPr>
       <w:r>
         <w:rPr>
-          <w:b/>
+          <w:rFonts w:ascii="Aptos" w:hAnsi="Aptos" w:eastAsia="Microsoft YaHei"/>
+          <w:b w:val="0"/>
+          <w:sz w:val="19"/>
         </w:rPr>
-        <w:t>AI 与自动化：</w:t>
-      </w:r>
-      <w:r>
-        <w:t xml:space="preserve"> Microsoft Copilot、ChatGPT、Gemini、DeepSeek、Codex CLI、AI Agent 工作流、结构化提示词、Power Automate 基础</w:t>
+        <w:t>AI 与自动化： Microsoft Copilot、ChatGPT、Gemini、DeepSeek、Codex CLI、AI Agent 工作流、结构化提示词、Power Automate 基础</w:t>
       </w:r>
     </w:p>
     <w:p>
       <w:pPr>
         <w:pStyle w:val="ListBullet"/>
-        <w:spacing w:after="30"/>
+        <w:spacing w:after="50" w:line="254" w:lineRule="auto"/>
+        <w:ind w:left="238"/>
       </w:pPr>
       <w:r>
         <w:rPr>
-          <w:b/>
+          <w:rFonts w:ascii="Aptos" w:hAnsi="Aptos" w:eastAsia="Microsoft YaHei"/>
+          <w:b w:val="0"/>
+          <w:sz w:val="19"/>
         </w:rPr>
-        <w:t>沟通：</w:t>
-      </w:r>
-      <w:r>
-        <w:t xml:space="preserve"> 英语可作为工作语言，普通话母语，可通过电话、邮件、Chat 和远程会话支持全球用户</w:t>
+        <w:t>沟通： 英语可作为工作语言，普通话母语，可通过电话、邮件、Chat 和远程会话支持全球用户</w:t>
       </w:r>
     </w:p>
     <w:p>
       <w:pPr>
-        <w:pStyle w:val="Heading1"/>
+        <w:spacing w:before="160" w:after="80" w:line="259" w:lineRule="auto"/>
+        <w:pBdr>
+          <w:bottom w:val="single" w:sz="6" w:space="8" w:color="CFE1DE"/>
+        </w:pBdr>
       </w:pPr>
       <w:r>
+        <w:rPr>
+          <w:rFonts w:ascii="Aptos" w:hAnsi="Aptos" w:eastAsia="Microsoft YaHei"/>
+          <w:b/>
+          <w:color w:val="0D5258"/>
+          <w:sz w:val="25"/>
+        </w:rPr>
         <w:t>工作经历</w:t>
       </w:r>
     </w:p>
     <w:p>
       <w:pPr>
-        <w:pStyle w:val="Heading2"/>
+        <w:spacing w:before="120" w:after="40" w:line="259" w:lineRule="auto"/>
       </w:pPr>
       <w:r>
+        <w:rPr>
+          <w:rFonts w:ascii="Aptos" w:hAnsi="Aptos" w:eastAsia="Microsoft YaHei"/>
+          <w:b/>
+          <w:color w:val="17202A"/>
+          <w:sz w:val="21"/>
+        </w:rPr>
         <w:t>勤达睿（Kyndryl）信息科技有限公司 | 深圳 / 远程</w:t>
       </w:r>
     </w:p>
     <w:p>
       <w:pPr>
-        <w:spacing w:after="60"/>
+        <w:spacing w:before="0" w:after="40" w:line="259" w:lineRule="auto"/>
       </w:pPr>
       <w:r>
         <w:rPr>
-          <w:b/>
+          <w:rFonts w:ascii="Aptos" w:hAnsi="Aptos" w:eastAsia="Microsoft YaHei"/>
+          <w:b w:val="0"/>
+          <w:color w:val="4C5660"/>
+          <w:sz w:val="19"/>
         </w:rPr>
-        <w:t>IT 技术支持专家，L1.5 / ServiceNow</w:t>
-      </w:r>
-      <w:r>
-        <w:t xml:space="preserve"> | 2022.04 - 至今</w:t>
+        <w:t>IT 技术支持专家，L1.5 / ServiceNow | 2022.04 - 至今</w:t>
       </w:r>
     </w:p>
     <w:p>
       <w:pPr>
-        <w:spacing w:after="60"/>
+        <w:spacing w:before="0" w:after="80" w:line="269" w:lineRule="auto"/>
       </w:pPr>
       <w:r>
+        <w:rPr>
+          <w:rFonts w:ascii="Aptos" w:hAnsi="Aptos" w:eastAsia="Microsoft YaHei"/>
+          <w:b w:val="0"/>
+          <w:color w:val="2C3741"/>
+          <w:sz w:val="20"/>
+        </w:rPr>
         <w:t>客户环境：Yageo 制造业 IT；AIA Service Desk 项目</w:t>
       </w:r>
     </w:p>
     <w:p>
       <w:pPr>
         <w:pStyle w:val="ListBullet"/>
-        <w:spacing w:after="30"/>
+        <w:spacing w:after="50" w:line="254" w:lineRule="auto"/>
+        <w:ind w:left="238"/>
       </w:pPr>
       <w:r>
-        <w:t>2021 年 7 月通过同方鼎欣进入当时 IBM / Kyndryl 支持环境做外包支持，约 9 个月后于 2022 年 4 月转为 Kyndryl 正式员工。在当时项目环境里，这属于很快的转正节奏，也来自一线工作中的持续优秀表现。</w:t>
+        <w:rPr>
+          <w:rFonts w:ascii="Aptos" w:hAnsi="Aptos" w:eastAsia="Microsoft YaHei"/>
+          <w:b w:val="0"/>
+          <w:sz w:val="19"/>
+        </w:rPr>
+        <w:t>2021 年 7 月通过同方鼎欣进入 IBM / Kyndryl 支持环境，约 9 个月后于 2022 年 4 月转为 Kyndryl 正式员工，主要来自稳定的工单质量、清晰的用户沟通和可靠的一线表现。</w:t>
       </w:r>
     </w:p>
     <w:p>
       <w:pPr>
         <w:pStyle w:val="ListBullet"/>
-        <w:spacing w:after="30"/>
+        <w:spacing w:after="50" w:line="254" w:lineRule="auto"/>
+        <w:ind w:left="238"/>
       </w:pPr>
       <w:r>
+        <w:rPr>
+          <w:rFonts w:ascii="Aptos" w:hAnsi="Aptos" w:eastAsia="Microsoft YaHei"/>
+          <w:b w:val="0"/>
+          <w:sz w:val="19"/>
+        </w:rPr>
         <w:t>面向 Yageo 全球用户，通过英文电话、邮件、Chat 和远程会话处理 Windows、Microsoft 365、VPN、MFA、账号、终端和应用问题。</w:t>
       </w:r>
     </w:p>
     <w:p>
       <w:pPr>
         <w:pStyle w:val="ListBullet"/>
-        <w:spacing w:after="30"/>
+        <w:spacing w:after="50" w:line="254" w:lineRule="auto"/>
+        <w:ind w:left="238"/>
       </w:pPr>
       <w:r>
+        <w:rPr>
+          <w:rFonts w:ascii="Aptos" w:hAnsi="Aptos" w:eastAsia="Microsoft YaHei"/>
+          <w:b w:val="0"/>
+          <w:sz w:val="19"/>
+        </w:rPr>
         <w:t>使用 ServiceNow 管理事件和请求，记录清楚的排障过程、用户影响和升级信息，方便后续团队接手。</w:t>
       </w:r>
     </w:p>
     <w:p>
       <w:pPr>
         <w:pStyle w:val="ListBullet"/>
-        <w:spacing w:after="30"/>
+        <w:spacing w:after="50" w:line="254" w:lineRule="auto"/>
+        <w:ind w:left="238"/>
       </w:pPr>
       <w:r>
+        <w:rPr>
+          <w:rFonts w:ascii="Aptos" w:hAnsi="Aptos" w:eastAsia="Microsoft YaHei"/>
+          <w:b w:val="0"/>
+          <w:sz w:val="19"/>
+        </w:rPr>
         <w:t>曾支持约一年的 AIA 友邦保险 Service Desk 项目，为一个长期运行的项目重新梳理详细知识文档、培训材料和视频式操作说明。</w:t>
       </w:r>
     </w:p>
     <w:p>
       <w:pPr>
         <w:pStyle w:val="ListBullet"/>
-        <w:spacing w:after="30"/>
+        <w:spacing w:after="50" w:line="254" w:lineRule="auto"/>
+        <w:ind w:left="238"/>
       </w:pPr>
       <w:r>
-        <w:t>持续根据 Yageo 的真实 incident 更新知识库。在 AI 普及前，我就已经手工整理 KB、交接说明和培训材料；现在则谨慎使用 AI 辅助起草、归纳和检查，并严格避免暴露公司或用户敏感数据。</w:t>
+        <w:rPr>
+          <w:rFonts w:ascii="Aptos" w:hAnsi="Aptos" w:eastAsia="Microsoft YaHei"/>
+          <w:b w:val="0"/>
+          <w:sz w:val="19"/>
+        </w:rPr>
+        <w:t>持续根据 Yageo 的真实 incident 更新知识库，包括 KB 文章、交接说明和排障指南。现在会谨慎使用 AI 辅助起草、归纳和检查，同时严格避免把公司或用户敏感数据输入公开工具。</w:t>
       </w:r>
     </w:p>
     <w:p>
       <w:pPr>
         <w:pStyle w:val="ListBullet"/>
-        <w:spacing w:after="30"/>
+        <w:spacing w:after="50" w:line="254" w:lineRule="auto"/>
+        <w:ind w:left="238"/>
       </w:pPr>
       <w:r>
+        <w:rPr>
+          <w:rFonts w:ascii="Aptos" w:hAnsi="Aptos" w:eastAsia="Microsoft YaHei"/>
+          <w:b w:val="0"/>
+          <w:sz w:val="19"/>
+        </w:rPr>
         <w:t>使用 Microsoft Copilot、结构化提示词和本地笔记流程优化工单摘要、知识库草稿和支持清单。</w:t>
       </w:r>
     </w:p>
     <w:p>
       <w:pPr>
-        <w:pStyle w:val="Heading2"/>
+        <w:spacing w:before="120" w:after="40" w:line="259" w:lineRule="auto"/>
       </w:pPr>
       <w:r>
+        <w:rPr>
+          <w:rFonts w:ascii="Aptos" w:hAnsi="Aptos" w:eastAsia="Microsoft YaHei"/>
+          <w:b/>
+          <w:color w:val="17202A"/>
+          <w:sz w:val="21"/>
+        </w:rPr>
         <w:t>同方鼎欣科技股份有限公司（ASDC）| 深圳</w:t>
       </w:r>
     </w:p>
     <w:p>
       <w:pPr>
-        <w:spacing w:after="60"/>
+        <w:spacing w:before="0" w:after="40" w:line="259" w:lineRule="auto"/>
       </w:pPr>
       <w:r>
         <w:rPr>
-          <w:b/>
+          <w:rFonts w:ascii="Aptos" w:hAnsi="Aptos" w:eastAsia="Microsoft YaHei"/>
+          <w:b w:val="0"/>
+          <w:color w:val="4C5660"/>
+          <w:sz w:val="19"/>
         </w:rPr>
-        <w:t>双语技术支持代表，外派 IBM / Kyndryl UPS 项目</w:t>
-      </w:r>
-      <w:r>
-        <w:t xml:space="preserve"> | 2021.07 - 2022.04</w:t>
+        <w:t>双语技术支持代表，外派 IBM / Kyndryl UPS 项目 | 2021.07 - 2022.04</w:t>
       </w:r>
     </w:p>
     <w:p>
       <w:pPr>
         <w:pStyle w:val="ListBullet"/>
-        <w:spacing w:after="30"/>
+        <w:spacing w:after="50" w:line="254" w:lineRule="auto"/>
+        <w:ind w:left="238"/>
       </w:pPr>
       <w:r>
+        <w:rPr>
+          <w:rFonts w:ascii="Aptos" w:hAnsi="Aptos" w:eastAsia="Microsoft YaHei"/>
+          <w:b w:val="0"/>
+          <w:sz w:val="19"/>
+        </w:rPr>
         <w:t>在 24/7 服务环境中，为 UPS 内部用户和外部客户提供中英文技术支持。</w:t>
       </w:r>
     </w:p>
     <w:p>
       <w:pPr>
         <w:pStyle w:val="ListBullet"/>
-        <w:spacing w:after="30"/>
+        <w:spacing w:after="50" w:line="254" w:lineRule="auto"/>
+        <w:ind w:left="238"/>
       </w:pPr>
       <w:r>
+        <w:rPr>
+          <w:rFonts w:ascii="Aptos" w:hAnsi="Aptos" w:eastAsia="Microsoft YaHei"/>
+          <w:b w:val="0"/>
+          <w:sz w:val="19"/>
+        </w:rPr>
         <w:t>在 SLA 要求内处理软件、硬件、账号访问和办公效率工具问题。</w:t>
       </w:r>
     </w:p>
     <w:p>
       <w:pPr>
         <w:pStyle w:val="ListBullet"/>
-        <w:spacing w:after="30"/>
+        <w:spacing w:after="50" w:line="254" w:lineRule="auto"/>
+        <w:ind w:left="238"/>
       </w:pPr>
       <w:r>
+        <w:rPr>
+          <w:rFonts w:ascii="Aptos" w:hAnsi="Aptos" w:eastAsia="Microsoft YaHei"/>
+          <w:b w:val="0"/>
+          <w:sz w:val="19"/>
+        </w:rPr>
         <w:t>将复杂问题升级至 L2/L3 团队，并提供清晰的诊断记录和用户影响背景。</w:t>
       </w:r>
     </w:p>
     <w:p>
       <w:pPr>
         <w:pStyle w:val="ListBullet"/>
-        <w:spacing w:after="30"/>
+        <w:spacing w:after="50" w:line="254" w:lineRule="auto"/>
+        <w:ind w:left="238"/>
       </w:pPr>
       <w:r>
+        <w:rPr>
+          <w:rFonts w:ascii="Aptos" w:hAnsi="Aptos" w:eastAsia="Microsoft YaHei"/>
+          <w:b w:val="0"/>
+          <w:sz w:val="19"/>
+        </w:rPr>
         <w:t>这段经历训练了电话沟通、耐心、问题澄清和书面交接能力，也为后续转为 Kyndryl 正式员工打下基础。</w:t>
       </w:r>
     </w:p>
     <w:p>
       <w:pPr>
-        <w:pStyle w:val="Heading2"/>
+        <w:spacing w:before="120" w:after="40" w:line="259" w:lineRule="auto"/>
       </w:pPr>
       <w:r>
+        <w:rPr>
+          <w:rFonts w:ascii="Aptos" w:hAnsi="Aptos" w:eastAsia="Microsoft YaHei"/>
+          <w:b/>
+          <w:color w:val="17202A"/>
+          <w:sz w:val="21"/>
+        </w:rPr>
         <w:t>深圳市亚思迈拓科技发展有限公司 | 深圳</w:t>
       </w:r>
     </w:p>
     <w:p>
       <w:pPr>
-        <w:spacing w:after="60"/>
+        <w:spacing w:before="0" w:after="40" w:line="259" w:lineRule="auto"/>
       </w:pPr>
       <w:r>
         <w:rPr>
-          <w:b/>
+          <w:rFonts w:ascii="Aptos" w:hAnsi="Aptos" w:eastAsia="Microsoft YaHei"/>
+          <w:b w:val="0"/>
+          <w:color w:val="4C5660"/>
+          <w:sz w:val="19"/>
         </w:rPr>
-        <w:t>B2B 外贸销售 / 英文直播 / 店铺运营</w:t>
-      </w:r>
-      <w:r>
-        <w:t xml:space="preserve"> | 2019.07 - 2021.07</w:t>
+        <w:t>B2B 外贸销售 / 英文直播 / 店铺运营 | 2019.07 - 2021.07</w:t>
       </w:r>
     </w:p>
     <w:p>
       <w:pPr>
         <w:pStyle w:val="ListBullet"/>
-        <w:spacing w:after="30"/>
+        <w:spacing w:after="50" w:line="254" w:lineRule="auto"/>
+        <w:ind w:left="238"/>
       </w:pPr>
       <w:r>
+        <w:rPr>
+          <w:rFonts w:ascii="Aptos" w:hAnsi="Aptos" w:eastAsia="Microsoft YaHei"/>
+          <w:b w:val="0"/>
+          <w:sz w:val="19"/>
+        </w:rPr>
         <w:t>负责阿里巴巴国际站汽车电子产品的海外 B2B 销售，并用英文与海外客户沟通。</w:t>
       </w:r>
     </w:p>
     <w:p>
       <w:pPr>
         <w:pStyle w:val="ListBullet"/>
-        <w:spacing w:after="30"/>
+        <w:spacing w:after="50" w:line="254" w:lineRule="auto"/>
+        <w:ind w:left="238"/>
       </w:pPr>
       <w:r>
+        <w:rPr>
+          <w:rFonts w:ascii="Aptos" w:hAnsi="Aptos" w:eastAsia="Microsoft YaHei"/>
+          <w:b w:val="0"/>
+          <w:sz w:val="19"/>
+        </w:rPr>
         <w:t>通过英文直播、书面跟进和产品讲解服务海外客户。</w:t>
       </w:r>
     </w:p>
     <w:p>
       <w:pPr>
         <w:pStyle w:val="ListBullet"/>
-        <w:spacing w:after="30"/>
+        <w:spacing w:after="50" w:line="254" w:lineRule="auto"/>
+        <w:ind w:left="238"/>
       </w:pPr>
       <w:r>
+        <w:rPr>
+          <w:rFonts w:ascii="Aptos" w:hAnsi="Aptos" w:eastAsia="Microsoft YaHei"/>
+          <w:b w:val="0"/>
+          <w:sz w:val="19"/>
+        </w:rPr>
         <w:t>整理重复销售和运营步骤，形成流程文档习惯，并迁移到后续 IT 支持工作中。</w:t>
       </w:r>
     </w:p>
     <w:p>
       <w:pPr>
-        <w:pStyle w:val="Heading2"/>
+        <w:spacing w:before="120" w:after="40" w:line="259" w:lineRule="auto"/>
       </w:pPr>
       <w:r>
+        <w:rPr>
+          <w:rFonts w:ascii="Aptos" w:hAnsi="Aptos" w:eastAsia="Microsoft YaHei"/>
+          <w:b/>
+          <w:color w:val="17202A"/>
+          <w:sz w:val="21"/>
+        </w:rPr>
         <w:t>早期服务与教学经历 | 南京 / 苏州 / 深圳</w:t>
       </w:r>
     </w:p>
     <w:p>
       <w:pPr>
-        <w:spacing w:after="60"/>
+        <w:spacing w:before="0" w:after="40" w:line="259" w:lineRule="auto"/>
       </w:pPr>
       <w:r>
         <w:rPr>
-          <w:b/>
+          <w:rFonts w:ascii="Aptos" w:hAnsi="Aptos" w:eastAsia="Microsoft YaHei"/>
+          <w:b w:val="0"/>
+          <w:color w:val="4C5660"/>
+          <w:sz w:val="19"/>
         </w:rPr>
-        <w:t>小饭店经营、厨师、酒店服务、成人英语与健身一对一辅导</w:t>
-      </w:r>
-      <w:r>
-        <w:t xml:space="preserve"> | 2012 - 2019</w:t>
+        <w:t>小饭店经营、厨师、酒店服务、成人英语与健身一对一辅导 | 2012 - 2019</w:t>
       </w:r>
     </w:p>
     <w:p>
       <w:pPr>
         <w:pStyle w:val="ListBullet"/>
-        <w:spacing w:after="30"/>
+        <w:spacing w:after="50" w:line="254" w:lineRule="auto"/>
+        <w:ind w:left="238"/>
       </w:pPr>
       <w:r>
+        <w:rPr>
+          <w:rFonts w:ascii="Aptos" w:hAnsi="Aptos" w:eastAsia="Microsoft YaHei"/>
+          <w:b w:val="0"/>
+          <w:sz w:val="19"/>
+        </w:rPr>
         <w:t>开过早餐和简餐小店，也在酒店和餐饮后厨工作过，从一线服务里学习抗压和执行。</w:t>
       </w:r>
     </w:p>
     <w:p>
       <w:pPr>
         <w:pStyle w:val="ListBullet"/>
-        <w:spacing w:after="30"/>
+        <w:spacing w:after="50" w:line="254" w:lineRule="auto"/>
+        <w:ind w:left="238"/>
       </w:pPr>
       <w:r>
+        <w:rPr>
+          <w:rFonts w:ascii="Aptos" w:hAnsi="Aptos" w:eastAsia="Microsoft YaHei"/>
+          <w:b w:val="0"/>
+          <w:sz w:val="19"/>
+        </w:rPr>
         <w:t>做过成人英语和健身的一对一收费辅导，训练了解释、鼓励、纠错和因人调整的方法。</w:t>
       </w:r>
     </w:p>
     <w:p>
       <w:pPr>
         <w:pStyle w:val="ListBullet"/>
-        <w:spacing w:after="30"/>
+        <w:spacing w:after="50" w:line="254" w:lineRule="auto"/>
+        <w:ind w:left="238"/>
       </w:pPr>
       <w:r>
-        <w:t>这些经历不是 IT 简历的核心，但能解释我为什么适合做需要耐心、沟通和教学能力的技术支持。</w:t>
+        <w:rPr>
+          <w:rFonts w:ascii="Aptos" w:hAnsi="Aptos" w:eastAsia="Microsoft YaHei"/>
+          <w:b w:val="0"/>
+          <w:sz w:val="19"/>
+        </w:rPr>
+        <w:t>这些经历培养了我的耐心、服务意识和把复杂步骤讲清楚的能力，现在也直接服务于技术支持工作。</w:t>
       </w:r>
     </w:p>
     <w:p>
       <w:pPr>
-        <w:pStyle w:val="Heading1"/>
+        <w:spacing w:before="160" w:after="80" w:line="259" w:lineRule="auto"/>
+        <w:pBdr>
+          <w:bottom w:val="single" w:sz="6" w:space="8" w:color="CFE1DE"/>
+        </w:pBdr>
       </w:pPr>
       <w:r>
+        <w:rPr>
+          <w:rFonts w:ascii="Aptos" w:hAnsi="Aptos" w:eastAsia="Microsoft YaHei"/>
+          <w:b/>
+          <w:color w:val="0D5258"/>
+          <w:sz w:val="25"/>
+        </w:rPr>
         <w:t>代表性工作内容</w:t>
       </w:r>
     </w:p>
     <w:p>
       <w:pPr>
-        <w:pStyle w:val="Heading2"/>
+        <w:spacing w:before="120" w:after="40" w:line="259" w:lineRule="auto"/>
       </w:pPr>
       <w:r>
+        <w:rPr>
+          <w:rFonts w:ascii="Aptos" w:hAnsi="Aptos" w:eastAsia="Microsoft YaHei"/>
+          <w:b/>
+          <w:color w:val="17202A"/>
+          <w:sz w:val="21"/>
+        </w:rPr>
         <w:t>AIA 与 Yageo 知识库整理</w:t>
       </w:r>
     </w:p>
     <w:p>
       <w:pPr>
-        <w:spacing w:after="60"/>
+        <w:spacing w:before="0" w:after="80" w:line="269" w:lineRule="auto"/>
       </w:pPr>
       <w:r>
+        <w:rPr>
+          <w:rFonts w:ascii="Aptos" w:hAnsi="Aptos" w:eastAsia="Microsoft YaHei"/>
+          <w:b w:val="0"/>
+          <w:color w:val="2C3741"/>
+          <w:sz w:val="20"/>
+        </w:rPr>
         <w:t>整理 SOP、常见问题处理步骤、新人上手资料和培训内容，让长期运行的支持项目能更清楚地交接，也让重复 incident 更容易被团队稳定处理。</w:t>
       </w:r>
     </w:p>
     <w:p>
       <w:pPr>
-        <w:pStyle w:val="Heading2"/>
+        <w:spacing w:before="120" w:after="40" w:line="259" w:lineRule="auto"/>
       </w:pPr>
       <w:r>
+        <w:rPr>
+          <w:rFonts w:ascii="Aptos" w:hAnsi="Aptos" w:eastAsia="Microsoft YaHei"/>
+          <w:b/>
+          <w:color w:val="17202A"/>
+          <w:sz w:val="21"/>
+        </w:rPr>
         <w:t>AI 辅助 IT 支持流程</w:t>
       </w:r>
     </w:p>
     <w:p>
       <w:pPr>
-        <w:spacing w:after="60"/>
+        <w:spacing w:before="0" w:after="80" w:line="269" w:lineRule="auto"/>
       </w:pPr>
       <w:r>
+        <w:rPr>
+          <w:rFonts w:ascii="Aptos" w:hAnsi="Aptos" w:eastAsia="Microsoft YaHei"/>
+          <w:b w:val="0"/>
+          <w:color w:val="2C3741"/>
+          <w:sz w:val="20"/>
+        </w:rPr>
         <w:t>使用 Copilot、ChatGPT 类工具、结构化提示词和本地笔记流程，整理工单摘要、知识库大纲和排障清单，同时坚持不把公司或用户敏感信息输入公开 AI 工具。</w:t>
       </w:r>
     </w:p>
     <w:p>
       <w:pPr>
-        <w:pStyle w:val="Heading2"/>
+        <w:spacing w:before="120" w:after="40" w:line="259" w:lineRule="auto"/>
       </w:pPr>
       <w:r>
+        <w:rPr>
+          <w:rFonts w:ascii="Aptos" w:hAnsi="Aptos" w:eastAsia="Microsoft YaHei"/>
+          <w:b/>
+          <w:color w:val="17202A"/>
+          <w:sz w:val="21"/>
+        </w:rPr>
         <w:t>一对一教学式支持</w:t>
       </w:r>
     </w:p>
     <w:p>
       <w:pPr>
-        <w:spacing w:after="60"/>
+        <w:spacing w:before="0" w:after="80" w:line="269" w:lineRule="auto"/>
       </w:pPr>
       <w:r>
+        <w:rPr>
+          <w:rFonts w:ascii="Aptos" w:hAnsi="Aptos" w:eastAsia="Microsoft YaHei"/>
+          <w:b w:val="0"/>
+          <w:color w:val="2C3741"/>
+          <w:sz w:val="20"/>
+        </w:rPr>
         <w:t>成人英语和健身辅导经历让我更习惯先听懂问题，再找到卡点，用用户能听懂、能复述的方式讲下一步。</w:t>
       </w:r>
     </w:p>
     <w:p>
       <w:pPr>
-        <w:pStyle w:val="Heading1"/>
+        <w:spacing w:before="160" w:after="80" w:line="259" w:lineRule="auto"/>
+        <w:pBdr>
+          <w:bottom w:val="single" w:sz="6" w:space="8" w:color="CFE1DE"/>
+        </w:pBdr>
       </w:pPr>
       <w:r>
+        <w:rPr>
+          <w:rFonts w:ascii="Aptos" w:hAnsi="Aptos" w:eastAsia="Microsoft YaHei"/>
+          <w:b/>
+          <w:color w:val="0D5258"/>
+          <w:sz w:val="25"/>
+        </w:rPr>
         <w:t>认证证书</w:t>
       </w:r>
     </w:p>
     <w:p>
       <w:pPr>
         <w:pStyle w:val="ListBullet"/>
-        <w:spacing w:after="30"/>
+        <w:spacing w:after="50" w:line="254" w:lineRule="auto"/>
+        <w:ind w:left="238"/>
       </w:pPr>
       <w:r>
+        <w:rPr>
+          <w:rFonts w:ascii="Aptos" w:hAnsi="Aptos" w:eastAsia="Microsoft YaHei"/>
+          <w:b w:val="0"/>
+          <w:sz w:val="19"/>
+        </w:rPr>
         <w:t>ITIL 4 Foundation - IT 服务管理</w:t>
       </w:r>
     </w:p>
     <w:p>
       <w:pPr>
         <w:pStyle w:val="ListBullet"/>
-        <w:spacing w:after="30"/>
+        <w:spacing w:after="50" w:line="254" w:lineRule="auto"/>
+        <w:ind w:left="238"/>
       </w:pPr>
       <w:r>
+        <w:rPr>
+          <w:rFonts w:ascii="Aptos" w:hAnsi="Aptos" w:eastAsia="Microsoft YaHei"/>
+          <w:b w:val="0"/>
+          <w:sz w:val="19"/>
+        </w:rPr>
         <w:t>Microsoft 365 Certified: Fundamentals</w:t>
       </w:r>
     </w:p>
     <w:p>
       <w:pPr>
         <w:pStyle w:val="ListBullet"/>
-        <w:spacing w:after="30"/>
+        <w:spacing w:after="50" w:line="254" w:lineRule="auto"/>
+        <w:ind w:left="238"/>
       </w:pPr>
       <w:r>
+        <w:rPr>
+          <w:rFonts w:ascii="Aptos" w:hAnsi="Aptos" w:eastAsia="Microsoft YaHei"/>
+          <w:b w:val="0"/>
+          <w:sz w:val="19"/>
+        </w:rPr>
         <w:t>Microsoft Certified: Azure Fundamentals</w:t>
       </w:r>
     </w:p>
     <w:p>
       <w:pPr>
         <w:pStyle w:val="ListBullet"/>
-        <w:spacing w:after="30"/>
+        <w:spacing w:after="50" w:line="254" w:lineRule="auto"/>
+        <w:ind w:left="238"/>
       </w:pPr>
       <w:r>
+        <w:rPr>
+          <w:rFonts w:ascii="Aptos" w:hAnsi="Aptos" w:eastAsia="Microsoft YaHei"/>
+          <w:b w:val="0"/>
+          <w:sz w:val="19"/>
+        </w:rPr>
         <w:t>Microsoft Certified: Security, Compliance, and Identity Fundamentals</w:t>
       </w:r>
     </w:p>
     <w:p>
       <w:pPr>
         <w:pStyle w:val="ListBullet"/>
-        <w:spacing w:after="30"/>
+        <w:spacing w:after="50" w:line="254" w:lineRule="auto"/>
+        <w:ind w:left="238"/>
       </w:pPr>
       <w:r>
+        <w:rPr>
+          <w:rFonts w:ascii="Aptos" w:hAnsi="Aptos" w:eastAsia="Microsoft YaHei"/>
+          <w:b w:val="0"/>
+          <w:sz w:val="19"/>
+        </w:rPr>
         <w:t>Microsoft Certified: Power Platform Fundamentals</w:t>
       </w:r>
     </w:p>
     <w:p>
       <w:pPr>
         <w:pStyle w:val="ListBullet"/>
-        <w:spacing w:after="30"/>
+        <w:spacing w:after="50" w:line="254" w:lineRule="auto"/>
+        <w:ind w:left="238"/>
       </w:pPr>
       <w:r>
+        <w:rPr>
+          <w:rFonts w:ascii="Aptos" w:hAnsi="Aptos" w:eastAsia="Microsoft YaHei"/>
+          <w:b w:val="0"/>
+          <w:sz w:val="19"/>
+        </w:rPr>
         <w:t>Microsoft Certified: Azure AI Fundamentals</w:t>
       </w:r>
     </w:p>
     <w:p>
       <w:pPr>
         <w:pStyle w:val="ListBullet"/>
-        <w:spacing w:after="30"/>
+        <w:spacing w:after="50" w:line="254" w:lineRule="auto"/>
+        <w:ind w:left="238"/>
       </w:pPr>
       <w:r>
+        <w:rPr>
+          <w:rFonts w:ascii="Aptos" w:hAnsi="Aptos" w:eastAsia="Microsoft YaHei"/>
+          <w:b w:val="0"/>
+          <w:sz w:val="19"/>
+        </w:rPr>
         <w:t>Microsoft Certified: Azure Data Fundamentals</w:t>
       </w:r>
     </w:p>
     <w:p>
       <w:pPr>
         <w:pStyle w:val="ListBullet"/>
-        <w:spacing w:after="30"/>
+        <w:spacing w:after="50" w:line="254" w:lineRule="auto"/>
+        <w:ind w:left="238"/>
       </w:pPr>
       <w:r>
+        <w:rPr>
+          <w:rFonts w:ascii="Aptos" w:hAnsi="Aptos" w:eastAsia="Microsoft YaHei"/>
+          <w:b w:val="0"/>
+          <w:sz w:val="19"/>
+        </w:rPr>
         <w:t>Microsoft Certified: Dynamics 365 Fundamentals (ERP)</w:t>
       </w:r>
     </w:p>
     <w:p>
       <w:pPr>
         <w:pStyle w:val="ListBullet"/>
-        <w:spacing w:after="30"/>
+        <w:spacing w:after="50" w:line="254" w:lineRule="auto"/>
+        <w:ind w:left="238"/>
       </w:pPr>
       <w:r>
+        <w:rPr>
+          <w:rFonts w:ascii="Aptos" w:hAnsi="Aptos" w:eastAsia="Microsoft YaHei"/>
+          <w:b w:val="0"/>
+          <w:sz w:val="19"/>
+        </w:rPr>
         <w:t>Microsoft Certified: Dynamics 365 Fundamentals (CRM)</w:t>
       </w:r>
     </w:p>
     <w:p>
       <w:pPr>
         <w:pStyle w:val="ListBullet"/>
-        <w:spacing w:after="30"/>
+        <w:spacing w:after="50" w:line="254" w:lineRule="auto"/>
+        <w:ind w:left="238"/>
       </w:pPr>
       <w:r>
+        <w:rPr>
+          <w:rFonts w:ascii="Aptos" w:hAnsi="Aptos" w:eastAsia="Microsoft YaHei"/>
+          <w:b w:val="0"/>
+          <w:sz w:val="19"/>
+        </w:rPr>
         <w:t>AWS Partner: Accreditation (Business)</w:t>
       </w:r>
     </w:p>
     <w:p>
       <w:pPr>
         <w:pStyle w:val="ListBullet"/>
-        <w:spacing w:after="30"/>
+        <w:spacing w:after="50" w:line="254" w:lineRule="auto"/>
+        <w:ind w:left="238"/>
       </w:pPr>
       <w:r>
+        <w:rPr>
+          <w:rFonts w:ascii="Aptos" w:hAnsi="Aptos" w:eastAsia="Microsoft YaHei"/>
+          <w:b w:val="0"/>
+          <w:sz w:val="19"/>
+        </w:rPr>
         <w:t>AWS Partner: SAP on AWS (Business)</w:t>
       </w:r>
     </w:p>
     <w:p>
       <w:pPr>
-        <w:pStyle w:val="Heading1"/>
+        <w:spacing w:before="160" w:after="80" w:line="259" w:lineRule="auto"/>
+        <w:pBdr>
+          <w:bottom w:val="single" w:sz="6" w:space="8" w:color="CFE1DE"/>
+        </w:pBdr>
       </w:pPr>
       <w:r>
+        <w:rPr>
+          <w:rFonts w:ascii="Aptos" w:hAnsi="Aptos" w:eastAsia="Microsoft YaHei"/>
+          <w:b/>
+          <w:color w:val="0D5258"/>
+          <w:sz w:val="25"/>
+        </w:rPr>
         <w:t>教育与持续学习</w:t>
       </w:r>
     </w:p>
     <w:p>
       <w:pPr>
         <w:pStyle w:val="ListBullet"/>
-        <w:spacing w:after="30"/>
+        <w:spacing w:after="50" w:line="254" w:lineRule="auto"/>
+        <w:ind w:left="238"/>
       </w:pPr>
       <w:r>
         <w:rPr>
-          <w:b/>
+          <w:rFonts w:ascii="Aptos" w:hAnsi="Aptos" w:eastAsia="Microsoft YaHei"/>
+          <w:b w:val="0"/>
+          <w:sz w:val="19"/>
         </w:rPr>
-        <w:t>广东外语外贸大学</w:t>
-      </w:r>
-      <w:r>
-        <w:t xml:space="preserve"> | 英语专业，自考本科 | 在读</w:t>
+        <w:t>广东外语外贸大学 | 英语专业，自考本科 | 在读</w:t>
       </w:r>
     </w:p>
     <w:p>
       <w:pPr>
         <w:pStyle w:val="ListBullet"/>
-        <w:spacing w:after="30"/>
+        <w:spacing w:after="50" w:line="254" w:lineRule="auto"/>
+        <w:ind w:left="238"/>
       </w:pPr>
       <w:r>
         <w:rPr>
-          <w:b/>
+          <w:rFonts w:ascii="Aptos" w:hAnsi="Aptos" w:eastAsia="Microsoft YaHei"/>
+          <w:b w:val="0"/>
+          <w:sz w:val="19"/>
         </w:rPr>
-        <w:t>南京信息工程大学</w:t>
-      </w:r>
-      <w:r>
-        <w:t xml:space="preserve"> | 财务管理自考项目 | 2011 - 2012，后因工作与经济原因中断</w:t>
+        <w:t>南京信息工程大学 | 财务管理自考项目 | 2011 - 2012，后因工作与经济原因中断</w:t>
       </w:r>
     </w:p>
     <w:p>
       <w:pPr>
         <w:pStyle w:val="ListBullet"/>
-        <w:spacing w:after="30"/>
+        <w:spacing w:after="50" w:line="254" w:lineRule="auto"/>
+        <w:ind w:left="238"/>
       </w:pPr>
       <w:r>
         <w:rPr>
-          <w:b/>
+          <w:rFonts w:ascii="Aptos" w:hAnsi="Aptos" w:eastAsia="Microsoft YaHei"/>
+          <w:b w:val="0"/>
+          <w:sz w:val="19"/>
         </w:rPr>
-        <w:t>持续学习：</w:t>
-      </w:r>
-      <w:r>
-        <w:t xml:space="preserve"> Kyndryl 内部课程、微软认证、得到 App 用户 AZ，963 学分，得到学生证 182111265578</w:t>
+        <w:t>持续学习： Kyndryl 内部课程、微软认证、得到 App 用户 AZ，963 学分，得到学生证 182111265578</w:t>
       </w:r>
     </w:p>
     <w:p>
       <w:pPr>
         <w:pStyle w:val="ListBullet"/>
-        <w:spacing w:after="30"/>
+        <w:spacing w:after="50" w:line="254" w:lineRule="auto"/>
+        <w:ind w:left="238"/>
       </w:pPr>
       <w:r>
+        <w:rPr>
+          <w:rFonts w:ascii="Aptos" w:hAnsi="Aptos" w:eastAsia="Microsoft YaHei"/>
+          <w:b w:val="0"/>
+          <w:sz w:val="19"/>
+        </w:rPr>
         <w:t>当前学习方向：Linux、编程与 Vibe Coding、网络安全、AI Agent 工具、日语/西班牙语/法语基础</w:t>
       </w:r>
     </w:p>
     <w:p>
       <w:pPr>
-        <w:pStyle w:val="Heading1"/>
+        <w:spacing w:before="160" w:after="80" w:line="259" w:lineRule="auto"/>
+        <w:pBdr>
+          <w:bottom w:val="single" w:sz="6" w:space="8" w:color="CFE1DE"/>
+        </w:pBdr>
       </w:pPr>
       <w:r>
+        <w:rPr>
+          <w:rFonts w:ascii="Aptos" w:hAnsi="Aptos" w:eastAsia="Microsoft YaHei"/>
+          <w:b/>
+          <w:color w:val="0D5258"/>
+          <w:sz w:val="25"/>
+        </w:rPr>
         <w:t>语言能力</w:t>
       </w:r>
     </w:p>
     <w:p>
       <w:pPr>
         <w:pStyle w:val="ListBullet"/>
-        <w:spacing w:after="30"/>
+        <w:spacing w:after="50" w:line="254" w:lineRule="auto"/>
+        <w:ind w:left="238"/>
       </w:pPr>
       <w:r>
+        <w:rPr>
+          <w:rFonts w:ascii="Aptos" w:hAnsi="Aptos" w:eastAsia="Microsoft YaHei"/>
+          <w:b w:val="0"/>
+          <w:sz w:val="19"/>
+        </w:rPr>
         <w:t>普通话：母语</w:t>
       </w:r>
     </w:p>
     <w:p>
       <w:pPr>
         <w:pStyle w:val="ListBullet"/>
-        <w:spacing w:after="30"/>
+        <w:spacing w:after="50" w:line="254" w:lineRule="auto"/>
+        <w:ind w:left="238"/>
       </w:pPr>
       <w:r>
+        <w:rPr>
+          <w:rFonts w:ascii="Aptos" w:hAnsi="Aptos" w:eastAsia="Microsoft YaHei"/>
+          <w:b w:val="0"/>
+          <w:sz w:val="19"/>
+        </w:rPr>
         <w:t>英语：流利，可作为工作语言</w:t>
       </w:r>
     </w:p>
     <w:sectPr>
       <w:pgSz w:w="12240" w:h="15840"/>
-      <w:pgMar w:top="792" w:right="893" w:bottom="792" w:left="893" w:header="720" w:footer="720" w:gutter="0"/>
+      <w:pgMar w:top="765" w:right="879" w:bottom="709" w:left="879" w:header="720" w:footer="720" w:gutter="0"/>
       <w:cols w:space="720"/>
       <w:docGrid w:linePitch="360"/>
     </w:sectPr>
@@ -1088,8 +1481,8 @@
     <w:qFormat/>
     <w:rsid w:val="00FC693F"/>
     <w:rPr>
-      <w:rFonts w:ascii="Arial" w:hAnsi="Arial"/>
-      <w:sz w:val="19"/>
+      <w:rFonts w:ascii="Aptos" w:hAnsi="Aptos" w:eastAsia="Microsoft YaHei"/>
+      <w:sz w:val="20"/>
     </w:rPr>
   </w:style>
   <w:style w:type="paragraph" w:styleId="Header">
@@ -1151,7 +1544,7 @@
       <w:outlineLvl w:val="0"/>
     </w:pPr>
     <w:rPr>
-      <w:rFonts w:asciiTheme="majorHAnsi" w:eastAsiaTheme="majorEastAsia" w:hAnsiTheme="majorHAnsi" w:cstheme="majorBidi" w:ascii="Arial" w:hAnsi="Arial"/>
+      <w:rFonts w:asciiTheme="majorHAnsi" w:eastAsiaTheme="majorEastAsia" w:hAnsiTheme="majorHAnsi" w:cstheme="majorBidi"/>
       <w:b/>
       <w:bCs/>
       <w:color w:val="365F91" w:themeColor="accent1" w:themeShade="BF"/>
@@ -1175,11 +1568,11 @@
       <w:outlineLvl w:val="1"/>
     </w:pPr>
     <w:rPr>
-      <w:rFonts w:asciiTheme="majorHAnsi" w:eastAsiaTheme="majorEastAsia" w:hAnsiTheme="majorHAnsi" w:cstheme="majorBidi" w:ascii="Arial" w:hAnsi="Arial"/>
+      <w:rFonts w:asciiTheme="majorHAnsi" w:eastAsiaTheme="majorEastAsia" w:hAnsiTheme="majorHAnsi" w:cstheme="majorBidi"/>
       <w:b/>
       <w:bCs/>
       <w:color w:val="4F81BD" w:themeColor="accent1"/>
-      <w:sz w:val="24"/>
+      <w:sz w:val="26"/>
       <w:szCs w:val="26"/>
     </w:rPr>
   </w:style>
@@ -1199,11 +1592,10 @@
       <w:outlineLvl w:val="2"/>
     </w:pPr>
     <w:rPr>
-      <w:rFonts w:asciiTheme="majorHAnsi" w:eastAsiaTheme="majorEastAsia" w:hAnsiTheme="majorHAnsi" w:cstheme="majorBidi" w:ascii="Arial" w:hAnsi="Arial"/>
+      <w:rFonts w:asciiTheme="majorHAnsi" w:eastAsiaTheme="majorEastAsia" w:hAnsiTheme="majorHAnsi" w:cstheme="majorBidi"/>
       <w:b/>
       <w:bCs/>
       <w:color w:val="4F81BD" w:themeColor="accent1"/>
-      <w:sz w:val="21"/>
     </w:rPr>
   </w:style>
   <w:style w:type="paragraph" w:styleId="Heading4">
@@ -1441,11 +1833,11 @@
       <w:contextualSpacing/>
     </w:pPr>
     <w:rPr>
-      <w:rFonts w:asciiTheme="majorHAnsi" w:eastAsiaTheme="majorEastAsia" w:hAnsiTheme="majorHAnsi" w:cstheme="majorBidi" w:ascii="Arial" w:hAnsi="Arial"/>
+      <w:rFonts w:asciiTheme="majorHAnsi" w:eastAsiaTheme="majorEastAsia" w:hAnsiTheme="majorHAnsi" w:cstheme="majorBidi"/>
       <w:color w:val="17365D" w:themeColor="text2" w:themeShade="BF"/>
       <w:spacing w:val="5"/>
       <w:kern w:val="28"/>
-      <w:sz w:val="36"/>
+      <w:sz w:val="52"/>
       <w:szCs w:val="52"/>
     </w:rPr>
   </w:style>

</xml_diff>

<commit_message>
Publish portfolio chat privacy and resume updates
</commit_message>
<xml_diff>
--- a/resume/Alan_Zhu_Resume_CN.docx
+++ b/resume/Alan_Zhu_Resume_CN.docx
@@ -14,7 +14,7 @@
           <w:color w:val="0D5258"/>
           <w:sz w:val="42"/>
         </w:rPr>
-        <w:t>朱正飞（Alan Zhu）</w:t>
+        <w:t>朱正飞（Alan）</w:t>
       </w:r>
     </w:p>
     <w:p>
@@ -42,7 +42,7 @@
           <w:color w:val="4C5660"/>
           <w:sz w:val="19"/>
         </w:rPr>
-        <w:t>深圳，中国 | 1993年8月生 | WhatsApp / Telegram：+1 460 209 9928 | 国内电话 / 微信：+86 132 6720 5713</w:t>
+        <w:t>深圳，中国 | 1993年8月生 | WhatsApp：+1 460 209 9928 | 国内电话：+86 132 6720 5713</w:t>
       </w:r>
     </w:p>
     <w:p>
@@ -56,7 +56,7 @@
           <w:color w:val="2C3741"/>
           <w:sz w:val="20"/>
         </w:rPr>
-        <w:t>邮箱：alan.xiaofei224@gmail.com | 备用邮箱：alan.xiaofei993@outlook.com</w:t>
+        <w:t>Outlook：alan.xiaofei993@outlook.com | 微信：见主页联系区二维码</w:t>
       </w:r>
     </w:p>
     <w:p>
@@ -147,7 +147,7 @@
           <w:b w:val="0"/>
           <w:sz w:val="19"/>
         </w:rPr>
-        <w:t>IT Technical Support Specialist / Global IT Support Specialist</w:t>
+        <w:t>IT 技术支持专家 / 全球 IT 支持专家（IT Technical Support Specialist / Global IT Support Specialist）</w:t>
       </w:r>
     </w:p>
     <w:p>
@@ -162,7 +162,7 @@
           <w:b w:val="0"/>
           <w:sz w:val="19"/>
         </w:rPr>
-        <w:t>ITSM Support Analyst / ServiceNow Support Analyst</w:t>
+        <w:t>ITSM 支持分析师 / ServiceNow 支持分析师（ITSM Support Analyst / ServiceNow Support Analyst）</w:t>
       </w:r>
     </w:p>
     <w:p>
@@ -177,7 +177,7 @@
           <w:b w:val="0"/>
           <w:sz w:val="19"/>
         </w:rPr>
-        <w:t>L1.5 / Tier 2-ready Technical Support</w:t>
+        <w:t>L1.5 / 准二线技术支持（L1.5 / Tier 2-ready Technical Support）</w:t>
       </w:r>
     </w:p>
     <w:p>
@@ -192,7 +192,7 @@
           <w:b w:val="0"/>
           <w:sz w:val="19"/>
         </w:rPr>
-        <w:t>Knowledge Management / Support Documentation Specialist</w:t>
+        <w:t>知识管理 / 支持文档专员（Knowledge Management / Support Documentation Specialist）</w:t>
       </w:r>
     </w:p>
     <w:p>
@@ -207,7 +207,7 @@
           <w:b w:val="0"/>
           <w:sz w:val="19"/>
         </w:rPr>
-        <w:t>AI-enabled IT Operations / Support Automation Coordinator</w:t>
+        <w:t>AI 辅助 IT 运维 / 支持自动化协调（AI-enabled IT Operations / Support Automation Coordinator）</w:t>
       </w:r>
     </w:p>
     <w:p>
@@ -222,7 +222,7 @@
           <w:b w:val="0"/>
           <w:sz w:val="19"/>
         </w:rPr>
-        <w:t>Manufacturing IT Support / End User Computing Support</w:t>
+        <w:t>制造业 IT 支持 / 终端用户计算支持（Manufacturing IT Support / End User Computing Support）</w:t>
       </w:r>
     </w:p>
     <w:p>
@@ -477,7 +477,7 @@
           <w:color w:val="17202A"/>
           <w:sz w:val="21"/>
         </w:rPr>
-        <w:t>同方鼎欣科技股份有限公司（ASDC）| 深圳</w:t>
+        <w:t>同方鼎欣科技股份有限公司（ASDC，Advanced Systems Development，外包服务公司）| 深圳</w:t>
       </w:r>
     </w:p>
     <w:p>
@@ -506,7 +506,7 @@
           <w:b w:val="0"/>
           <w:sz w:val="19"/>
         </w:rPr>
-        <w:t>在 24/7 服务环境中，为 UPS 内部用户和外部客户提供中英文技术支持。</w:t>
+        <w:t>通过同方鼎欣（ASDC）外派至 IBM / Kyndryl UPS 项目，在 24/7 服务环境中为 UPS 内部用户和外部客户提供中英文技术支持。</w:t>
       </w:r>
     </w:p>
     <w:p>
@@ -667,7 +667,22 @@
           <w:b w:val="0"/>
           <w:sz w:val="19"/>
         </w:rPr>
-        <w:t>开过早餐和简餐小店，也在酒店和餐饮后厨工作过，从一线服务里学习抗压和执行。</w:t>
+        <w:t>曾在福建福州世纪金源大饭店中餐后厨约两年，接触闽菜和粤菜；也在深圳福田中洲圣庭苑酒店约两年，做过 1 楼自助餐厅和 29 楼 VIP 餐厅厨师。</w:t>
+      </w:r>
+    </w:p>
+    <w:p>
+      <w:pPr>
+        <w:pStyle w:val="ListBullet"/>
+        <w:spacing w:after="50" w:line="254" w:lineRule="auto"/>
+        <w:ind w:left="238"/>
+      </w:pPr>
+      <w:r>
+        <w:rPr>
+          <w:rFonts w:ascii="Aptos" w:hAnsi="Aptos" w:eastAsia="Microsoft YaHei"/>
+          <w:b w:val="0"/>
+          <w:sz w:val="19"/>
+        </w:rPr>
+        <w:t>后来也开过早餐和简餐小店，从一线服务里学习抗压、执行和交付意识。</w:t>
       </w:r>
     </w:p>
     <w:p>
@@ -985,6 +1000,21 @@
     </w:p>
     <w:p>
       <w:pPr>
+        <w:pStyle w:val="ListBullet"/>
+        <w:spacing w:after="50" w:line="254" w:lineRule="auto"/>
+        <w:ind w:left="238"/>
+      </w:pPr>
+      <w:r>
+        <w:rPr>
+          <w:rFonts w:ascii="Aptos" w:hAnsi="Aptos" w:eastAsia="Microsoft YaHei"/>
+          <w:b w:val="0"/>
+          <w:sz w:val="19"/>
+        </w:rPr>
+        <w:t>meTTle Program - DWS Top Talent 领导力成长、导师制与战略学习项目记录</w:t>
+      </w:r>
+    </w:p>
+    <w:p>
+      <w:pPr>
         <w:spacing w:before="160" w:after="80" w:line="259" w:lineRule="auto"/>
         <w:pBdr>
           <w:bottom w:val="single" w:sz="6" w:space="8" w:color="CFE1DE"/>
@@ -1042,7 +1072,7 @@
           <w:b w:val="0"/>
           <w:sz w:val="19"/>
         </w:rPr>
-        <w:t>持续学习： Kyndryl 内部课程、微软认证、得到 App 用户 AZ，963 学分，得到学生证 182111265578</w:t>
+        <w:t>持续学习： Kyndryl 内部课程、微软认证、得到 App 用户 AZ，963 学分</w:t>
       </w:r>
     </w:p>
     <w:p>

</xml_diff>

<commit_message>
Publish portfolio privacy update
</commit_message>
<xml_diff>
--- a/resume/Alan_Zhu_Resume_CN.docx
+++ b/resume/Alan_Zhu_Resume_CN.docx
@@ -28,7 +28,7 @@
           <w:color w:val="4C5660"/>
           <w:sz w:val="19"/>
         </w:rPr>
-        <w:t>双语 IT 技术支持专家 | ITSM Support Analyst | Microsoft 365 / ServiceNow / 知识管理 | AI 辅助支持流程</w:t>
+        <w:t>双语 IT 支持与自动化专员 | ITSM Support Analyst | ServiceNow / Microsoft 365 / 知识管理 | AI 驱动支持流程</w:t>
       </w:r>
     </w:p>
     <w:p>
@@ -42,21 +42,7 @@
           <w:color w:val="4C5660"/>
           <w:sz w:val="19"/>
         </w:rPr>
-        <w:t>深圳，中国 | 1993年8月生 | WhatsApp：+1 460 209 9928 | 国内电话：+86 132 6720 5713</w:t>
-      </w:r>
-    </w:p>
-    <w:p>
-      <w:pPr>
-        <w:spacing w:before="0" w:after="80" w:line="269" w:lineRule="auto"/>
-      </w:pPr>
-      <w:r>
-        <w:rPr>
-          <w:rFonts w:ascii="Aptos" w:hAnsi="Aptos" w:eastAsia="Microsoft YaHei"/>
-          <w:b w:val="0"/>
-          <w:color w:val="2C3741"/>
-          <w:sz w:val="20"/>
-        </w:rPr>
-        <w:t>Outlook：alan.xiaofei993@outlook.com | 微信：见主页联系区二维码</w:t>
+        <w:t>深圳，中国 | Outlook：alan.xiaofei993@outlook.com</w:t>
       </w:r>
     </w:p>
     <w:p>
@@ -101,7 +87,7 @@
           <w:color w:val="2C3741"/>
           <w:sz w:val="20"/>
         </w:rPr>
-        <w:t>拥有 4 年以上 IT 技术支持经验，经历过 Kyndryl、UPS 支持、AIA 支持项目和 Yageo 制造业 IT 环境。主要处理 Windows、Microsoft 365、账号、VPN、MFA、终端、应用和 ServiceNow 相关问题，也会把重复出现的问题整理成知识库、培训材料和更清楚的升级记录。</w:t>
+        <w:t>拥有 4 年以上 IT 技术支持经验，经历过 Kyndryl、UPS 支持、AIA Service Desk 项目和 Yageo 制造业 IT 环境。主要帮助全球用户处理 Windows、Microsoft 365、VPN、MFA、账号、终端、应用和 ServiceNow 相关问题，并把重复修复沉淀成 SOP、知识库文章、培训材料和更清楚的升级记录。</w:t>
       </w:r>
     </w:p>
     <w:p>
@@ -115,7 +101,7 @@
           <w:color w:val="2C3741"/>
           <w:sz w:val="20"/>
         </w:rPr>
-        <w:t>我的 IT 职业路径建立在持续自学、认证学习和真实支持经验之上，也来自更早期的服务、销售、教学和辅导经历。进入 IT 前，我开过小饭店、做过厨师、做过外贸销售，也一对一收费教过成人英语和健身。这些经历让我能在压力下保持冷静，把技术步骤讲清楚，并在环境变化时继续学习。</w:t>
+        <w:t>我的下一阶段方向不是只匹配传统 IT 支持岗位，而是帮助团队通过知识管理、Microsoft 365 效率协作、Obsidian/Notion 类知识系统、结构化提示词、AI Agent 工作流和实用自动化，减少重复支持成本。我会负责任地使用 AI：公司和客户数据不进入公开工具，AI 生成内容必须经过复核，才会进入支持文档或用户指导。</w:t>
       </w:r>
     </w:p>
     <w:p>
@@ -147,7 +133,7 @@
           <w:b w:val="0"/>
           <w:sz w:val="19"/>
         </w:rPr>
-        <w:t>IT 技术支持专家 / 全球 IT 支持专家（IT Technical Support Specialist / Global IT Support Specialist）</w:t>
+        <w:t>IT 支持与自动化专员 / 全球 IT 支持专家（IT Support &amp; Automation Specialist / Global IT Support Specialist）</w:t>
       </w:r>
     </w:p>
     <w:p>
@@ -254,7 +240,7 @@
           <w:b w:val="0"/>
           <w:sz w:val="19"/>
         </w:rPr>
-        <w:t>ITSM 与支持： ServiceNow、事件/请求全生命周期、ITIL 4 Foundation、SLA 意识、升级记录</w:t>
+        <w:t>ITSM 与支持运营： ServiceNow、事件/请求全生命周期、ITIL 4 Foundation、SLA 意识、升级与交接记录</w:t>
       </w:r>
     </w:p>
     <w:p>
@@ -269,7 +255,7 @@
           <w:b w:val="0"/>
           <w:sz w:val="19"/>
         </w:rPr>
-        <w:t>终端与 Microsoft 365： Windows 10/11、Outlook、Teams、OneDrive、Microsoft 365 管理基础、Active Directory、VPN、MFA</w:t>
+        <w:t>终端、Microsoft 365 与安全基础： Windows 10/11、Outlook、Teams、OneDrive、Microsoft 365 管理基础、Active Directory 基础、VPN、MFA、账号访问支持</w:t>
       </w:r>
     </w:p>
     <w:p>
@@ -284,7 +270,7 @@
           <w:b w:val="0"/>
           <w:sz w:val="19"/>
         </w:rPr>
-        <w:t>知识库与培训： KB 文章、新人上手材料、SOP、培训笔记、视频式操作说明、一对一辅导</w:t>
+        <w:t>知识系统与赋能： KB 文章、SOP、新人上手材料、培训笔记、Markdown、Obsidian 工作流、Notion 类知识组织、Microsoft 365 文档协作习惯</w:t>
       </w:r>
     </w:p>
     <w:p>
@@ -299,7 +285,7 @@
           <w:b w:val="0"/>
           <w:sz w:val="19"/>
         </w:rPr>
-        <w:t>AI 与自动化： Microsoft Copilot、ChatGPT、Gemini、DeepSeek、Codex CLI、AI Agent 工作流、结构化提示词、Power Automate 基础</w:t>
+        <w:t>AI Agent 与自动化： Microsoft Copilot、ChatGPT、Gemini、DeepSeek、Codex CLI、AI Agent 工作流、结构化提示词、上下文/系统提示词设计、Power Automate 基础、MCP 工具意识</w:t>
       </w:r>
     </w:p>
     <w:p>
@@ -314,7 +300,7 @@
           <w:b w:val="0"/>
           <w:sz w:val="19"/>
         </w:rPr>
-        <w:t>沟通： 英语可作为工作语言，普通话母语，可通过电话、邮件、Chat 和远程会话支持全球用户</w:t>
+        <w:t>沟通与协调： 英语可作为工作语言，普通话母语，可通过电话、邮件、Chat 和远程会话支持全球用户，擅长异步书面更新和跨文化沟通</w:t>
       </w:r>
     </w:p>
     <w:p>
@@ -359,7 +345,7 @@
           <w:color w:val="4C5660"/>
           <w:sz w:val="19"/>
         </w:rPr>
-        <w:t>IT 技术支持专家，L1.5 / ServiceNow | 2022.04 - 至今</w:t>
+        <w:t>IT 技术支持专家，L1.5 / ServiceNow / 支持知识管理 | 2022.04 - 至今</w:t>
       </w:r>
     </w:p>
     <w:p>
@@ -433,6 +419,21 @@
           <w:b w:val="0"/>
           <w:sz w:val="19"/>
         </w:rPr>
+        <w:t>在全球支持环境中工作，需要清晰书面更新、远程协作和跨地区/跨时区的独立跟进能力。</w:t>
+      </w:r>
+    </w:p>
+    <w:p>
+      <w:pPr>
+        <w:pStyle w:val="ListBullet"/>
+        <w:spacing w:after="50" w:line="254" w:lineRule="auto"/>
+        <w:ind w:left="238"/>
+      </w:pPr>
+      <w:r>
+        <w:rPr>
+          <w:rFonts w:ascii="Aptos" w:hAnsi="Aptos" w:eastAsia="Microsoft YaHei"/>
+          <w:b w:val="0"/>
+          <w:sz w:val="19"/>
+        </w:rPr>
         <w:t>曾支持约一年的 AIA 友邦保险 Service Desk 项目，为一个长期运行的项目重新梳理详细知识文档、培训材料和视频式操作说明。</w:t>
       </w:r>
     </w:p>
@@ -448,7 +449,7 @@
           <w:b w:val="0"/>
           <w:sz w:val="19"/>
         </w:rPr>
-        <w:t>持续根据 Yageo 的真实 incident 更新知识库，包括 KB 文章、交接说明和排障指南。现在会谨慎使用 AI 辅助起草、归纳和检查，同时严格避免把公司或用户敏感数据输入公开工具。</w:t>
+        <w:t>持续根据 Yageo 的真实 incident 更新知识库，包括 KB 文章、交接说明和排障指南。</w:t>
       </w:r>
     </w:p>
     <w:p>
@@ -463,7 +464,7 @@
           <w:b w:val="0"/>
           <w:sz w:val="19"/>
         </w:rPr>
-        <w:t>使用 Microsoft Copilot、结构化提示词和本地笔记流程优化工单摘要、知识库草稿和支持清单。</w:t>
+        <w:t>使用 Microsoft Copilot、结构化提示词、本地笔记流程和 AI Agent 思维优化工单摘要、知识库草稿和支持清单，同时遵守数据安全边界。</w:t>
       </w:r>
     </w:p>
     <w:p>
@@ -667,7 +668,7 @@
           <w:b w:val="0"/>
           <w:sz w:val="19"/>
         </w:rPr>
-        <w:t>曾在福建福州世纪金源大饭店中餐后厨约两年，接触闽菜和粤菜；也在深圳福田中洲圣庭苑酒店约两年，做过 1 楼自助餐厅和 29 楼 VIP 餐厅厨师。</w:t>
+        <w:t>压缩概括：酒店后厨、小型餐饮经营、成人英语辅导和健身辅导经历，训练了我的抗压、服务纪律和实际解释能力。</w:t>
       </w:r>
     </w:p>
     <w:p>
@@ -682,37 +683,7 @@
           <w:b w:val="0"/>
           <w:sz w:val="19"/>
         </w:rPr>
-        <w:t>后来也开过早餐和简餐小店，从一线服务里学习抗压、执行和交付意识。</w:t>
-      </w:r>
-    </w:p>
-    <w:p>
-      <w:pPr>
-        <w:pStyle w:val="ListBullet"/>
-        <w:spacing w:after="50" w:line="254" w:lineRule="auto"/>
-        <w:ind w:left="238"/>
-      </w:pPr>
-      <w:r>
-        <w:rPr>
-          <w:rFonts w:ascii="Aptos" w:hAnsi="Aptos" w:eastAsia="Microsoft YaHei"/>
-          <w:b w:val="0"/>
-          <w:sz w:val="19"/>
-        </w:rPr>
-        <w:t>做过成人英语和健身的一对一收费辅导，训练了解释、鼓励、纠错和因人调整的方法。</w:t>
-      </w:r>
-    </w:p>
-    <w:p>
-      <w:pPr>
-        <w:pStyle w:val="ListBullet"/>
-        <w:spacing w:after="50" w:line="254" w:lineRule="auto"/>
-        <w:ind w:left="238"/>
-      </w:pPr>
-      <w:r>
-        <w:rPr>
-          <w:rFonts w:ascii="Aptos" w:hAnsi="Aptos" w:eastAsia="Microsoft YaHei"/>
-          <w:b w:val="0"/>
-          <w:sz w:val="19"/>
-        </w:rPr>
-        <w:t>这些经历培养了我的耐心、服务意识和把复杂步骤讲清楚的能力，现在也直接服务于技术支持工作。</w:t>
+        <w:t>这些不是 IT 简历的核心，但能解释我为什么能在用户压力下保持冷静、拆步骤教学，并持续改进重复流程。</w:t>
       </w:r>
     </w:p>
     <w:p>
@@ -743,21 +714,63 @@
           <w:color w:val="17202A"/>
           <w:sz w:val="21"/>
         </w:rPr>
-        <w:t>AIA 与 Yageo 知识库整理</w:t>
+        <w:t>Service Desk 知识库清理与 SOP 化</w:t>
       </w:r>
     </w:p>
     <w:p>
       <w:pPr>
-        <w:spacing w:before="0" w:after="80" w:line="269" w:lineRule="auto"/>
+        <w:spacing w:before="0" w:after="40" w:line="259" w:lineRule="auto"/>
       </w:pPr>
       <w:r>
         <w:rPr>
           <w:rFonts w:ascii="Aptos" w:hAnsi="Aptos" w:eastAsia="Microsoft YaHei"/>
           <w:b w:val="0"/>
-          <w:color w:val="2C3741"/>
-          <w:sz w:val="20"/>
+          <w:color w:val="4C5660"/>
+          <w:sz w:val="19"/>
         </w:rPr>
-        <w:t>整理 SOP、常见问题处理步骤、新人上手资料和培训内容，让长期运行的支持项目能更清楚地交接，也让重复 incident 更容易被团队稳定处理。</w:t>
+        <w:t>问题： Windows、Microsoft 365、VPN、MFA、账号和应用类重复 incident 容易造成解释不一致、交接慢、新人上手困难。</w:t>
+      </w:r>
+    </w:p>
+    <w:p>
+      <w:pPr>
+        <w:spacing w:before="0" w:after="40" w:line="259" w:lineRule="auto"/>
+      </w:pPr>
+      <w:r>
+        <w:rPr>
+          <w:rFonts w:ascii="Aptos" w:hAnsi="Aptos" w:eastAsia="Microsoft YaHei"/>
+          <w:b w:val="0"/>
+          <w:color w:val="4C5660"/>
+          <w:sz w:val="19"/>
+        </w:rPr>
+        <w:t>行动： 收集常见问题模式，把零散笔记改写成步骤化 SOP，区分用户可见步骤和内部升级记录，并补充前置条件与升级标准。</w:t>
+      </w:r>
+    </w:p>
+    <w:p>
+      <w:pPr>
+        <w:spacing w:before="0" w:after="40" w:line="259" w:lineRule="auto"/>
+      </w:pPr>
+      <w:r>
+        <w:rPr>
+          <w:rFonts w:ascii="Aptos" w:hAnsi="Aptos" w:eastAsia="Microsoft YaHei"/>
+          <w:b w:val="0"/>
+          <w:color w:val="4C5660"/>
+          <w:sz w:val="19"/>
+        </w:rPr>
+        <w:t>工具： ServiceNow、Microsoft 365、Windows 10/11、VPN/MFA 支持背景、Markdown、Obsidian 类笔记、AI 辅助草稿。</w:t>
+      </w:r>
+    </w:p>
+    <w:p>
+      <w:pPr>
+        <w:spacing w:before="0" w:after="40" w:line="259" w:lineRule="auto"/>
+      </w:pPr>
+      <w:r>
+        <w:rPr>
+          <w:rFonts w:ascii="Aptos" w:hAnsi="Aptos" w:eastAsia="Microsoft YaHei"/>
+          <w:b w:val="0"/>
+          <w:color w:val="4C5660"/>
+          <w:sz w:val="19"/>
+        </w:rPr>
+        <w:t>结果： 形成可复用支持笔记、上手材料和常见 L1/L1.5 场景排障指南。</w:t>
       </w:r>
     </w:p>
     <w:p>
@@ -771,21 +784,49 @@
           <w:color w:val="17202A"/>
           <w:sz w:val="21"/>
         </w:rPr>
-        <w:t>AI 辅助 IT 支持流程</w:t>
+        <w:t>AI Agent 工作流管理模型</w:t>
       </w:r>
     </w:p>
     <w:p>
       <w:pPr>
-        <w:spacing w:before="0" w:after="80" w:line="269" w:lineRule="auto"/>
+        <w:spacing w:before="0" w:after="40" w:line="259" w:lineRule="auto"/>
       </w:pPr>
       <w:r>
         <w:rPr>
           <w:rFonts w:ascii="Aptos" w:hAnsi="Aptos" w:eastAsia="Microsoft YaHei"/>
           <w:b w:val="0"/>
-          <w:color w:val="2C3741"/>
-          <w:sz w:val="20"/>
+          <w:color w:val="4C5660"/>
+          <w:sz w:val="19"/>
         </w:rPr>
-        <w:t>使用 Copilot、ChatGPT 类工具、结构化提示词和本地笔记流程，整理工单摘要、知识库大纲和排障清单，同时坚持不把公司或用户敏感信息输入公开 AI 工具。</w:t>
+        <w:t>准则： 我们正在从“问 AI”进入“管理 AI”的阶段。人的价值在于准备上下文和环境、明确目标、审查计划、监督过程、验收结果，并把有效方法沉淀成可复用技能或自动化。</w:t>
+      </w:r>
+    </w:p>
+    <w:p>
+      <w:pPr>
+        <w:spacing w:before="0" w:after="40" w:line="259" w:lineRule="auto"/>
+      </w:pPr>
+      <w:r>
+        <w:rPr>
+          <w:rFonts w:ascii="Aptos" w:hAnsi="Aptos" w:eastAsia="Microsoft YaHei"/>
+          <w:b w:val="0"/>
+          <w:color w:val="4C5660"/>
+          <w:sz w:val="19"/>
+        </w:rPr>
+        <w:t>流程： 用 Codex 类 Agent 处理本地文件、终端命令、计划模式、图片生成、浏览器/电脑操作、MCP 连接、定时任务、持久记忆和可复用技能。</w:t>
+      </w:r>
+    </w:p>
+    <w:p>
+      <w:pPr>
+        <w:spacing w:before="0" w:after="40" w:line="259" w:lineRule="auto"/>
+      </w:pPr>
+      <w:r>
+        <w:rPr>
+          <w:rFonts w:ascii="Aptos" w:hAnsi="Aptos" w:eastAsia="Microsoft YaHei"/>
+          <w:b w:val="0"/>
+          <w:color w:val="4C5660"/>
+          <w:sz w:val="19"/>
+        </w:rPr>
+        <w:t>边界： 公司和客户数据不进入公开工具，示例先脱敏，AI 输出必须验证后才能进入支持或文档流程。</w:t>
       </w:r>
     </w:p>
     <w:p>
@@ -799,21 +840,35 @@
           <w:color w:val="17202A"/>
           <w:sz w:val="21"/>
         </w:rPr>
-        <w:t>一对一教学式支持</w:t>
+        <w:t>双语全球支持与交接协调</w:t>
       </w:r>
     </w:p>
     <w:p>
       <w:pPr>
-        <w:spacing w:before="0" w:after="80" w:line="269" w:lineRule="auto"/>
+        <w:spacing w:before="0" w:after="40" w:line="259" w:lineRule="auto"/>
       </w:pPr>
       <w:r>
         <w:rPr>
           <w:rFonts w:ascii="Aptos" w:hAnsi="Aptos" w:eastAsia="Microsoft YaHei"/>
           <w:b w:val="0"/>
-          <w:color w:val="2C3741"/>
-          <w:sz w:val="20"/>
+          <w:color w:val="4C5660"/>
+          <w:sz w:val="19"/>
         </w:rPr>
-        <w:t>成人英语和健身辅导经历让我更习惯先听懂问题，再找到卡点，用用户能听懂、能复述的方式讲下一步。</w:t>
+        <w:t>问题： 全球支持不只是解决单个工单：用户需要稳定解释，下游团队需要清楚诊断背景，项目也需要可复用交接材料。</w:t>
+      </w:r>
+    </w:p>
+    <w:p>
+      <w:pPr>
+        <w:spacing w:before="0" w:after="40" w:line="259" w:lineRule="auto"/>
+      </w:pPr>
+      <w:r>
+        <w:rPr>
+          <w:rFonts w:ascii="Aptos" w:hAnsi="Aptos" w:eastAsia="Microsoft YaHei"/>
+          <w:b w:val="0"/>
+          <w:color w:val="4C5660"/>
+          <w:sz w:val="19"/>
+        </w:rPr>
+        <w:t>行动： 澄清症状、影响和前置条件；记录排障过程；带着证据升级；把重复解释整理成培训笔记。</w:t>
       </w:r>
     </w:p>
     <w:p>
@@ -1072,22 +1127,7 @@
           <w:b w:val="0"/>
           <w:sz w:val="19"/>
         </w:rPr>
-        <w:t>持续学习： Kyndryl 内部课程、微软认证、得到 App 用户 AZ，963 学分</w:t>
-      </w:r>
-    </w:p>
-    <w:p>
-      <w:pPr>
-        <w:pStyle w:val="ListBullet"/>
-        <w:spacing w:after="50" w:line="254" w:lineRule="auto"/>
-        <w:ind w:left="238"/>
-      </w:pPr>
-      <w:r>
-        <w:rPr>
-          <w:rFonts w:ascii="Aptos" w:hAnsi="Aptos" w:eastAsia="Microsoft YaHei"/>
-          <w:b w:val="0"/>
-          <w:sz w:val="19"/>
-        </w:rPr>
-        <w:t>当前学习方向：Linux、编程与 Vibe Coding、网络安全、AI Agent 工具、日语/西班牙语/法语基础</w:t>
+        <w:t>持续学习： Kyndryl 内部课程、微软认证、Linux 基础、网络安全基础、Microsoft 365 效率协作、Obsidian/Markdown 知识工作流、AI Agent、实用自动化，以及日语/西班牙语/法语基础</w:t>
       </w:r>
     </w:p>
     <w:p>

</xml_diff>

<commit_message>
Publish portfolio copy update
</commit_message>
<xml_diff>
--- a/resume/Alan_Zhu_Resume_CN.docx
+++ b/resume/Alan_Zhu_Resume_CN.docx
@@ -163,7 +163,7 @@
           <w:b w:val="0"/>
           <w:sz w:val="19"/>
         </w:rPr>
-        <w:t>L1.5 / 准二线技术支持（L1.5 / Tier 2-ready Technical Support）</w:t>
+        <w:t>复杂问题排障与升级协作（Advanced Technical Support / Escalation Coordination）</w:t>
       </w:r>
     </w:p>
     <w:p>
@@ -345,7 +345,7 @@
           <w:color w:val="4C5660"/>
           <w:sz w:val="19"/>
         </w:rPr>
-        <w:t>IT 技术支持专家，L1.5 / ServiceNow / 支持知识管理 | 2022.04 - 至今</w:t>
+        <w:t>IT 技术支持专家，ServiceNow / 支持知识管理 | 2022.04 - 至今</w:t>
       </w:r>
     </w:p>
     <w:p>
@@ -770,7 +770,7 @@
           <w:color w:val="4C5660"/>
           <w:sz w:val="19"/>
         </w:rPr>
-        <w:t>结果： 形成可复用支持笔记、上手材料和常见 L1/L1.5 场景排障指南。</w:t>
+        <w:t>结果： 形成可复用支持笔记、上手材料和常见支持场景排障指南。</w:t>
       </w:r>
     </w:p>
     <w:p>

</xml_diff>

<commit_message>
Publish ServiceNow Automation portfolio update
</commit_message>
<xml_diff>
--- a/resume/Alan_Zhu_Resume_CN.docx
+++ b/resume/Alan_Zhu_Resume_CN.docx
@@ -714,6 +714,76 @@
           <w:color w:val="17202A"/>
           <w:sz w:val="21"/>
         </w:rPr>
+        <w:t>ServiceNow Automation Workbench</w:t>
+      </w:r>
+    </w:p>
+    <w:p>
+      <w:pPr>
+        <w:spacing w:before="0" w:after="40" w:line="259" w:lineRule="auto"/>
+      </w:pPr>
+      <w:r>
+        <w:rPr>
+          <w:rFonts w:ascii="Aptos" w:hAnsi="Aptos" w:eastAsia="Microsoft YaHei"/>
+          <w:b w:val="0"/>
+          <w:color w:val="4C5660"/>
+          <w:sz w:val="19"/>
+        </w:rPr>
+        <w:t>问题： 重复 ITSM 工作如果分散在来源信息、工单草稿、KB 建议、测试记录和安全边界之间，会浪费大量整理与复核时间。</w:t>
+      </w:r>
+    </w:p>
+    <w:p>
+      <w:pPr>
+        <w:spacing w:before="0" w:after="40" w:line="259" w:lineRule="auto"/>
+      </w:pPr>
+      <w:r>
+        <w:rPr>
+          <w:rFonts w:ascii="Aptos" w:hAnsi="Aptos" w:eastAsia="Microsoft YaHei"/>
+          <w:b w:val="0"/>
+          <w:color w:val="4C5660"/>
+          <w:sz w:val="19"/>
+        </w:rPr>
+        <w:t>行动： 设计并发布了一个公开测试预览版 Electron/React 桌面工作台，用来演示脱敏 intake、清理摘要、Incident 草稿、本地 KB 推荐、引导式审核、月度 Excel 填写队列占位和人工审核优先的安全边界。</w:t>
+      </w:r>
+    </w:p>
+    <w:p>
+      <w:pPr>
+        <w:spacing w:before="0" w:after="40" w:line="259" w:lineRule="auto"/>
+      </w:pPr>
+      <w:r>
+        <w:rPr>
+          <w:rFonts w:ascii="Aptos" w:hAnsi="Aptos" w:eastAsia="Microsoft YaHei"/>
+          <w:b w:val="0"/>
+          <w:color w:val="4C5660"/>
+          <w:sz w:val="19"/>
+        </w:rPr>
+        <w:t>边界： v0.1.0 公开版本仅为测试预览版，不做真实 ServiceNow 登录自动化、真实工单提交、Save / Submit / Update / Resolve / Close 自动化、Microsoft Graph 或 Excel Web 写入，也不处理真实客户数据。</w:t>
+      </w:r>
+    </w:p>
+    <w:p>
+      <w:pPr>
+        <w:spacing w:before="0" w:after="40" w:line="259" w:lineRule="auto"/>
+      </w:pPr>
+      <w:r>
+        <w:rPr>
+          <w:rFonts w:ascii="Aptos" w:hAnsi="Aptos" w:eastAsia="Microsoft YaHei"/>
+          <w:b w:val="0"/>
+          <w:color w:val="4C5660"/>
+          <w:sz w:val="19"/>
+        </w:rPr>
+        <w:t>公开链接： GitHub 仓库：https://github.com/alanxiaofeifei/servicenow-automation | Release v0.1.0：https://github.com/alanxiaofeifei/servicenow-automation/releases/tag/v0.1.0</w:t>
+      </w:r>
+    </w:p>
+    <w:p>
+      <w:pPr>
+        <w:spacing w:before="120" w:after="40" w:line="259" w:lineRule="auto"/>
+      </w:pPr>
+      <w:r>
+        <w:rPr>
+          <w:rFonts w:ascii="Aptos" w:hAnsi="Aptos" w:eastAsia="Microsoft YaHei"/>
+          <w:b/>
+          <w:color w:val="17202A"/>
+          <w:sz w:val="21"/>
+        </w:rPr>
         <w:t>Service Desk 知识库清理与 SOP 化</w:t>
       </w:r>
     </w:p>

</xml_diff>

<commit_message>
Publish ServiceNow micro-certification update
</commit_message>
<xml_diff>
--- a/resume/Alan_Zhu_Resume_CN.docx
+++ b/resume/Alan_Zhu_Resume_CN.docx
@@ -985,6 +985,21 @@
           <w:b w:val="0"/>
           <w:sz w:val="19"/>
         </w:rPr>
+        <w:t>ServiceNow Micro-Certification - Welcome to ServiceNow（Credly，2026 年 6 月获得）</w:t>
+      </w:r>
+    </w:p>
+    <w:p>
+      <w:pPr>
+        <w:pStyle w:val="ListBullet"/>
+        <w:spacing w:after="50" w:line="254" w:lineRule="auto"/>
+        <w:ind w:left="238"/>
+      </w:pPr>
+      <w:r>
+        <w:rPr>
+          <w:rFonts w:ascii="Aptos" w:hAnsi="Aptos" w:eastAsia="Microsoft YaHei"/>
+          <w:b w:val="0"/>
+          <w:sz w:val="19"/>
+        </w:rPr>
         <w:t>Microsoft 365 Certified: Fundamentals</w:t>
       </w:r>
     </w:p>

</xml_diff>